<commit_message>
feat(docs): Mac-Finder-Screenshots in Word/PDF + 3 Anwendungsfaelle
Word/PDF: ASCII-Baeume durch echte macOS-Finder-Screenshots ersetzt (Objekt,
Einheiten-Chronik) + neue Sektion 'Drei Anwendungsfaelle' (Buy & Hold, Fix & Flip,
Kurzzeit). Screenshots als Assets unter docs/screenshots/. WordPress-Beitrag um
die drei Use Cases ergaenzt.

Co-Authored-By: Claude Opus 4.8 <noreply@anthropic.com>
</commit_message>
<xml_diff>
--- a/docs/Immobilien-Ablage-Ordnerstruktur.docx
+++ b/docs/Immobilien-Ablage-Ordnerstruktur.docx
@@ -415,225 +415,85 @@
         <w:pStyle w:val="Heading1"/>
       </w:pPr>
       <w:r>
-        <w:t xml:space="preserve">Die oberste Ebene</w:t>
-      </w:r>
-    </w:p>
-    <w:p>
-      <w:pPr>
-        <w:spacing w:after="120"/>
+        <w:t xml:space="preserve">So sieht es im Finder aus</w:t>
+      </w:r>
+    </w:p>
+    <w:p>
+      <w:pPr>
+        <w:spacing w:after="60"/>
       </w:pPr>
       <w:r>
         <w:rPr>
           <w:sz w:val="22"/>
           <w:szCs w:val="22"/>
         </w:rPr>
-        <w:t xml:space="preserve">So sieht die Wurzel mit zwei Halteformen aus:</w:t>
-      </w:r>
-    </w:p>
-    <w:tbl>
-      <w:tblPr>
-        <w:tblW w:type="dxa" w:w="9026"/>
-        <w:tblBorders>
-          <w:top w:val="single" w:color="auto" w:sz="4"/>
-          <w:left w:val="single" w:color="auto" w:sz="4"/>
-          <w:bottom w:val="single" w:color="auto" w:sz="4"/>
-          <w:right w:val="single" w:color="auto" w:sz="4"/>
-          <w:insideH w:val="single" w:color="auto" w:sz="4"/>
-          <w:insideV w:val="single" w:color="auto" w:sz="4"/>
-        </w:tblBorders>
-      </w:tblPr>
-      <w:tblGrid>
-        <w:gridCol w:w="9026"/>
-      </w:tblGrid>
-      <w:tr>
-        <w:tc>
-          <w:tcPr>
-            <w:tcW w:type="dxa" w:w="9026"/>
-            <w:tcBorders>
-              <w:top w:val="single" w:color="D9DEE8" w:sz="4"/>
-              <w:left w:val="single" w:color="D9DEE8" w:sz="4"/>
-              <w:bottom w:val="single" w:color="D9DEE8" w:sz="4"/>
-              <w:right w:val="single" w:color="D9DEE8" w:sz="4"/>
-            </w:tcBorders>
-            <w:shd w:fill="F2F4F8" w:val="clear"/>
-            <w:tcMar>
-              <w:top w:type="dxa" w:w="160"/>
-              <w:left w:type="dxa" w:w="200"/>
-              <w:bottom w:type="dxa" w:w="160"/>
-              <w:right w:type="dxa" w:w="160"/>
-            </w:tcMar>
-          </w:tcPr>
-          <w:p>
-            <w:pPr>
-              <w:spacing w:after="0" w:line="240"/>
-            </w:pPr>
-            <w:r>
-              <w:rPr>
-                <w:rFonts w:ascii="Consolas" w:cs="Consolas" w:eastAsia="Consolas" w:hAnsi="Consolas"/>
-                <w:color w:val="2C3340"/>
-                <w:sz w:val="18"/>
-                <w:szCs w:val="18"/>
-              </w:rPr>
-              <w:t xml:space="preserve">Immobilien/</w:t>
-            </w:r>
-          </w:p>
-          <w:p>
-            <w:pPr>
-              <w:spacing w:after="0" w:line="240"/>
-            </w:pPr>
-            <w:r>
-              <w:rPr>
-                <w:rFonts w:ascii="Consolas" w:cs="Consolas" w:eastAsia="Consolas" w:hAnsi="Consolas"/>
-                <w:color w:val="2C3340"/>
-                <w:sz w:val="18"/>
-                <w:szCs w:val="18"/>
-              </w:rPr>
-              <w:t xml:space="preserve">├── 00_Vorlagen/            Muster-Blankos</w:t>
-            </w:r>
-          </w:p>
-          <w:p>
-            <w:pPr>
-              <w:spacing w:after="0" w:line="240"/>
-            </w:pPr>
-            <w:r>
-              <w:rPr>
-                <w:rFonts w:ascii="Consolas" w:cs="Consolas" w:eastAsia="Consolas" w:hAnsi="Consolas"/>
-                <w:color w:val="2C3340"/>
-                <w:sz w:val="18"/>
-                <w:szCs w:val="18"/>
-              </w:rPr>
-              <w:t xml:space="preserve">├── 00_Portfolio/           Kürzel-Register + Übersicht</w:t>
-            </w:r>
-          </w:p>
-          <w:p>
-            <w:pPr>
-              <w:spacing w:after="0" w:line="240"/>
-            </w:pPr>
-            <w:r>
-              <w:rPr>
-                <w:rFonts w:ascii="Consolas" w:cs="Consolas" w:eastAsia="Consolas" w:hAnsi="Consolas"/>
-                <w:color w:val="2C3340"/>
-                <w:sz w:val="18"/>
-                <w:szCs w:val="18"/>
-              </w:rPr>
-              <w:t xml:space="preserve">│</w:t>
-            </w:r>
-          </w:p>
-          <w:p>
-            <w:pPr>
-              <w:spacing w:after="0" w:line="240"/>
-            </w:pPr>
-            <w:r>
-              <w:rPr>
-                <w:rFonts w:ascii="Consolas" w:cs="Consolas" w:eastAsia="Consolas" w:hAnsi="Consolas"/>
-                <w:color w:val="2C3340"/>
-                <w:sz w:val="18"/>
-                <w:szCs w:val="18"/>
-              </w:rPr>
-              <w:t xml:space="preserve">├── Musterbesitz GbR/</w:t>
-            </w:r>
-          </w:p>
-          <w:p>
-            <w:pPr>
-              <w:spacing w:after="0" w:line="240"/>
-            </w:pPr>
-            <w:r>
-              <w:rPr>
-                <w:rFonts w:ascii="Consolas" w:cs="Consolas" w:eastAsia="Consolas" w:hAnsi="Consolas"/>
-                <w:color w:val="2C3340"/>
-                <w:sz w:val="18"/>
-                <w:szCs w:val="18"/>
-              </w:rPr>
-              <w:t xml:space="preserve">│   ├── 00_Gesellschaft/    Gesellschaftsvertrag, Register</w:t>
-            </w:r>
-          </w:p>
-          <w:p>
-            <w:pPr>
-              <w:spacing w:after="0" w:line="240"/>
-            </w:pPr>
-            <w:r>
-              <w:rPr>
-                <w:rFonts w:ascii="Consolas" w:cs="Consolas" w:eastAsia="Consolas" w:hAnsi="Consolas"/>
-                <w:color w:val="2C3340"/>
-                <w:sz w:val="18"/>
-                <w:szCs w:val="18"/>
-              </w:rPr>
-              <w:t xml:space="preserve">│   ├── 0_Ankauf/           geprüfte Objekte (noch nicht gekauft)</w:t>
-            </w:r>
-          </w:p>
-          <w:p>
-            <w:pPr>
-              <w:spacing w:after="0" w:line="240"/>
-            </w:pPr>
-            <w:r>
-              <w:rPr>
-                <w:rFonts w:ascii="Consolas" w:cs="Consolas" w:eastAsia="Consolas" w:hAnsi="Consolas"/>
-                <w:color w:val="2C3340"/>
-                <w:sz w:val="18"/>
-                <w:szCs w:val="18"/>
-              </w:rPr>
-              <w:t xml:space="preserve">│   ├── 1_Bestand/          Objekte im Eigentum</w:t>
-            </w:r>
-          </w:p>
-          <w:p>
-            <w:pPr>
-              <w:spacing w:after="0" w:line="240"/>
-            </w:pPr>
-            <w:r>
-              <w:rPr>
-                <w:rFonts w:ascii="Consolas" w:cs="Consolas" w:eastAsia="Consolas" w:hAnsi="Consolas"/>
-                <w:color w:val="2C3340"/>
-                <w:sz w:val="18"/>
-                <w:szCs w:val="18"/>
-              </w:rPr>
-              <w:t xml:space="preserve">│   └── 2_Verkauft/         Archiv</w:t>
-            </w:r>
-          </w:p>
-          <w:p>
-            <w:pPr>
-              <w:spacing w:after="0" w:line="240"/>
-            </w:pPr>
-            <w:r>
-              <w:rPr>
-                <w:rFonts w:ascii="Consolas" w:cs="Consolas" w:eastAsia="Consolas" w:hAnsi="Consolas"/>
-                <w:color w:val="2C3340"/>
-                <w:sz w:val="18"/>
-                <w:szCs w:val="18"/>
-              </w:rPr>
-              <w:t xml:space="preserve">│</w:t>
-            </w:r>
-          </w:p>
-          <w:p>
-            <w:pPr>
-              <w:spacing w:after="0" w:line="240"/>
-            </w:pPr>
-            <w:r>
-              <w:rPr>
-                <w:rFonts w:ascii="Consolas" w:cs="Consolas" w:eastAsia="Consolas" w:hAnsi="Consolas"/>
-                <w:color w:val="2C3340"/>
-                <w:sz w:val="18"/>
-                <w:szCs w:val="18"/>
-              </w:rPr>
-              <w:t xml:space="preserve">└── Privat (Bruchteilseigentum)/</w:t>
-            </w:r>
-          </w:p>
-          <w:p>
-            <w:pPr>
-              <w:spacing w:after="0" w:line="240"/>
-            </w:pPr>
-            <w:r>
-              <w:rPr>
-                <w:rFonts w:ascii="Consolas" w:cs="Consolas" w:eastAsia="Consolas" w:hAnsi="Consolas"/>
-                <w:color w:val="2C3340"/>
-                <w:sz w:val="18"/>
-                <w:szCs w:val="18"/>
-              </w:rPr>
-              <w:t xml:space="preserve">    └── 0_Ankauf/   1_Bestand/   2_Verkauft/</w:t>
-            </w:r>
-          </w:p>
-        </w:tc>
-      </w:tr>
-    </w:tbl>
+        <w:t xml:space="preserve">Am Stamm liegen 00_Vorlagen und 00_Portfolio (Kürzel-Register), darunter pro Halteform 0_Ankauf / 1_Bestand / 2_Verkauft. Jedes Objekt im Bestand folgt derselben Struktur 00–09 – hier ein Mehrfamilienhaus:</w:t>
+      </w:r>
+    </w:p>
+    <w:p>
+      <w:pPr>
+        <w:keepNext/>
+        <w:keepLines/>
+        <w:spacing w:after="60" w:before="80"/>
+        <w:jc w:val="center"/>
+      </w:pPr>
+      <w:r>
+        <w:drawing>
+          <wp:inline distT="0" distB="0" distL="0" distR="0">
+            <wp:extent cx="5143500" cy="3524250"/>
+            <wp:effectExtent t="0" r="0" b="0" l="0"/>
+            <wp:docPr id="1" name="finder" descr="macOS Finder Beispielansicht der Ordnerstruktur" title="Finder-Beispiel"/>
+            <wp:cNvGraphicFramePr>
+              <a:graphicFrameLocks xmlns:a="http://schemas.openxmlformats.org/drawingml/2006/main" noChangeAspect="1"/>
+            </wp:cNvGraphicFramePr>
+            <a:graphic xmlns:a="http://schemas.openxmlformats.org/drawingml/2006/main">
+              <a:graphicData uri="http://schemas.openxmlformats.org/drawingml/2006/picture">
+                <pic:pic xmlns:pic="http://schemas.openxmlformats.org/drawingml/2006/picture">
+                  <pic:nvPicPr>
+                    <pic:cNvPr id="0" name="" descr=""/>
+                    <pic:cNvPicPr>
+                      <a:picLocks noChangeAspect="1" noChangeArrowheads="1"/>
+                    </pic:cNvPicPr>
+                  </pic:nvPicPr>
+                  <pic:blipFill>
+                    <a:blip r:embed="rId9" cstate="none"/>
+                    <a:srcRect/>
+                    <a:stretch>
+                      <a:fillRect/>
+                    </a:stretch>
+                  </pic:blipFill>
+                  <pic:spPr bwMode="auto">
+                    <a:xfrm>
+                      <a:off x="0" y="0"/>
+                      <a:ext cx="5143500" cy="3524250"/>
+                    </a:xfrm>
+                    <a:prstGeom prst="rect">
+                      <a:avLst/>
+                    </a:prstGeom>
+                  </pic:spPr>
+                </pic:pic>
+              </a:graphicData>
+            </a:graphic>
+          </wp:inline>
+        </w:drawing>
+      </w:r>
+    </w:p>
+    <w:p>
+      <w:pPr>
+        <w:spacing w:after="140"/>
+        <w:jc w:val="center"/>
+      </w:pPr>
+      <w:r>
+        <w:rPr>
+          <w:i/>
+          <w:iCs/>
+          <w:color w:val="5B6678"/>
+          <w:sz w:val="16"/>
+          <w:szCs w:val="16"/>
+        </w:rPr>
+        <w:t xml:space="preserve">Beispielobjekt im Bestand – Buy &amp; Hold</w:t>
+      </w:r>
+    </w:p>
     <w:p>
       <w:pPr>
         <w:pStyle w:val="Heading1"/>
@@ -1450,6 +1310,451 @@
         <w:t xml:space="preserve">Jede Wohnung ist ein stabiler Ordner. Darin liegt die Mieter-Chronik: pro Mieter ein datierter Ordner – so siehst du auf einen Blick, wer wann in der Wohnung wohnte, und behältst jede Mietakte.</w:t>
       </w:r>
     </w:p>
+    <w:p>
+      <w:pPr>
+        <w:keepNext/>
+        <w:keepLines/>
+        <w:spacing w:after="60" w:before="80"/>
+        <w:jc w:val="center"/>
+      </w:pPr>
+      <w:r>
+        <w:drawing>
+          <wp:inline distT="0" distB="0" distL="0" distR="0">
+            <wp:extent cx="5143500" cy="2971800"/>
+            <wp:effectExtent t="0" r="0" b="0" l="0"/>
+            <wp:docPr id="1" name="finder" descr="macOS Finder Beispielansicht der Ordnerstruktur" title="Finder-Beispiel"/>
+            <wp:cNvGraphicFramePr>
+              <a:graphicFrameLocks xmlns:a="http://schemas.openxmlformats.org/drawingml/2006/main" noChangeAspect="1"/>
+            </wp:cNvGraphicFramePr>
+            <a:graphic xmlns:a="http://schemas.openxmlformats.org/drawingml/2006/main">
+              <a:graphicData uri="http://schemas.openxmlformats.org/drawingml/2006/picture">
+                <pic:pic xmlns:pic="http://schemas.openxmlformats.org/drawingml/2006/picture">
+                  <pic:nvPicPr>
+                    <pic:cNvPr id="0" name="" descr=""/>
+                    <pic:cNvPicPr>
+                      <a:picLocks noChangeAspect="1" noChangeArrowheads="1"/>
+                    </pic:cNvPicPr>
+                  </pic:nvPicPr>
+                  <pic:blipFill>
+                    <a:blip r:embed="rId10" cstate="none"/>
+                    <a:srcRect/>
+                    <a:stretch>
+                      <a:fillRect/>
+                    </a:stretch>
+                  </pic:blipFill>
+                  <pic:spPr bwMode="auto">
+                    <a:xfrm>
+                      <a:off x="0" y="0"/>
+                      <a:ext cx="5143500" cy="2971800"/>
+                    </a:xfrm>
+                    <a:prstGeom prst="rect">
+                      <a:avLst/>
+                    </a:prstGeom>
+                  </pic:spPr>
+                </pic:pic>
+              </a:graphicData>
+            </a:graphic>
+          </wp:inline>
+        </w:drawing>
+      </w:r>
+    </w:p>
+    <w:p>
+      <w:pPr>
+        <w:spacing w:after="140"/>
+        <w:jc w:val="center"/>
+      </w:pPr>
+      <w:r>
+        <w:rPr>
+          <w:i/>
+          <w:iCs/>
+          <w:color w:val="5B6678"/>
+          <w:sz w:val="16"/>
+          <w:szCs w:val="16"/>
+        </w:rPr>
+        <w:t xml:space="preserve">Pro Wohnung eine chronologische Mieter-Liste – nichts wird gelöscht</w:t>
+      </w:r>
+    </w:p>
+    <w:p>
+      <w:pPr>
+        <w:spacing w:after="80"/>
+      </w:pPr>
+      <w:r>
+        <w:rPr>
+          <w:sz w:val="22"/>
+          <w:szCs w:val="22"/>
+        </w:rPr>
+        <w:t xml:space="preserve">Pro Mieter-Ordner: Mietvertrag, Selbstauskunft/Bonität, Kaution, Übergabe (Ein+Aus), Mieterhöhungen, Korrespondenz.</w:t>
+      </w:r>
+    </w:p>
+    <w:p>
+      <w:pPr>
+        <w:pStyle w:val="ListParagraph"/>
+        <w:numPr>
+          <w:ilvl w:val="0"/>
+          <w:numId w:val="2"/>
+        </w:numPr>
+        <w:spacing w:after="60"/>
+      </w:pPr>
+      <w:r>
+        <w:rPr>
+          <w:b/>
+          <w:bCs/>
+          <w:sz w:val="22"/>
+          <w:szCs w:val="22"/>
+        </w:rPr>
+        <w:t xml:space="preserve">Benennung: </w:t>
+      </w:r>
+      <w:r>
+        <w:rPr>
+          <w:sz w:val="22"/>
+          <w:szCs w:val="22"/>
+        </w:rPr>
+        <w:t xml:space="preserve">JJJJ-MM – heute · Name (aktueller Mieter), JJJJ-MM – JJJJ-MM · Name (Vormieter). Das Wort „heute“ markiert den aktuellen Mieter.</w:t>
+      </w:r>
+    </w:p>
+    <w:p>
+      <w:pPr>
+        <w:pStyle w:val="ListParagraph"/>
+        <w:numPr>
+          <w:ilvl w:val="0"/>
+          <w:numId w:val="2"/>
+        </w:numPr>
+        <w:spacing w:after="60"/>
+      </w:pPr>
+      <w:r>
+        <w:rPr>
+          <w:b/>
+          <w:bCs/>
+          <w:sz w:val="22"/>
+          <w:szCs w:val="22"/>
+        </w:rPr>
+        <w:t xml:space="preserve">Mieterwechsel = 2 Handgriffe: </w:t>
+      </w:r>
+      <w:r>
+        <w:rPr>
+          <w:sz w:val="22"/>
+          <w:szCs w:val="22"/>
+        </w:rPr>
+        <w:t xml:space="preserve">„heute“ durch das Auszugsdatum ersetzen (Ordner bleibt liegen, nichts löschen) und neuen Mieter-Ordner anlegen.</w:t>
+      </w:r>
+    </w:p>
+    <w:p>
+      <w:pPr>
+        <w:pStyle w:val="ListParagraph"/>
+        <w:numPr>
+          <w:ilvl w:val="0"/>
+          <w:numId w:val="2"/>
+        </w:numPr>
+        <w:spacing w:after="60"/>
+      </w:pPr>
+      <w:r>
+        <w:rPr>
+          <w:b/>
+          <w:bCs/>
+          <w:sz w:val="22"/>
+          <w:szCs w:val="22"/>
+        </w:rPr>
+        <w:t xml:space="preserve">Belege bleiben in 06_Belege: </w:t>
+      </w:r>
+      <w:r>
+        <w:rPr>
+          <w:sz w:val="22"/>
+          <w:szCs w:val="22"/>
+        </w:rPr>
+        <w:t xml:space="preserve">Rechnungen – auch Renovierung nach Auszug – gehören zur Buchhaltung/Steuer, nicht in den Mieter-Ordner.</w:t>
+      </w:r>
+    </w:p>
+    <w:p>
+      <w:pPr>
+        <w:pStyle w:val="Heading1"/>
+        <w:pageBreakBefore/>
+      </w:pPr>
+      <w:r>
+        <w:t xml:space="preserve">Drei Anwendungsfälle aus der Praxis</w:t>
+      </w:r>
+    </w:p>
+    <w:p>
+      <w:pPr>
+        <w:spacing w:after="100"/>
+      </w:pPr>
+      <w:r>
+        <w:rPr>
+          <w:sz w:val="22"/>
+          <w:szCs w:val="22"/>
+        </w:rPr>
+        <w:t xml:space="preserve">Dasselbe System, drei Strategien – damit du dich wiederfindest, egal wie du investierst. Buy &amp; Hold siehst du oben; hier Fix &amp; Flip und Kurzzeit.</w:t>
+      </w:r>
+    </w:p>
+    <w:p>
+      <w:pPr>
+        <w:spacing w:after="40"/>
+      </w:pPr>
+      <w:r>
+        <w:rPr>
+          <w:sz w:val="20"/>
+          <w:szCs w:val="20"/>
+        </w:rPr>
+        <w:t xml:space="preserve">Fix &amp; Flip: kaufen, sanieren, verkaufen. Das Objekt wandert 0_Ankauf → 1_Bestand → 2_Verkauft, der Verkauf bekommt einen eigenen Strang.</w:t>
+      </w:r>
+    </w:p>
+    <w:p>
+      <w:pPr>
+        <w:keepNext/>
+        <w:keepLines/>
+        <w:spacing w:after="60" w:before="80"/>
+        <w:jc w:val="center"/>
+      </w:pPr>
+      <w:r>
+        <w:drawing>
+          <wp:inline distT="0" distB="0" distL="0" distR="0">
+            <wp:extent cx="4953000" cy="5524500"/>
+            <wp:effectExtent t="0" r="0" b="0" l="0"/>
+            <wp:docPr id="1" name="finder" descr="macOS Finder Beispielansicht der Ordnerstruktur" title="Finder-Beispiel"/>
+            <wp:cNvGraphicFramePr>
+              <a:graphicFrameLocks xmlns:a="http://schemas.openxmlformats.org/drawingml/2006/main" noChangeAspect="1"/>
+            </wp:cNvGraphicFramePr>
+            <a:graphic xmlns:a="http://schemas.openxmlformats.org/drawingml/2006/main">
+              <a:graphicData uri="http://schemas.openxmlformats.org/drawingml/2006/picture">
+                <pic:pic xmlns:pic="http://schemas.openxmlformats.org/drawingml/2006/picture">
+                  <pic:nvPicPr>
+                    <pic:cNvPr id="0" name="" descr=""/>
+                    <pic:cNvPicPr>
+                      <a:picLocks noChangeAspect="1" noChangeArrowheads="1"/>
+                    </pic:cNvPicPr>
+                  </pic:nvPicPr>
+                  <pic:blipFill>
+                    <a:blip r:embed="rId11" cstate="none"/>
+                    <a:srcRect/>
+                    <a:stretch>
+                      <a:fillRect/>
+                    </a:stretch>
+                  </pic:blipFill>
+                  <pic:spPr bwMode="auto">
+                    <a:xfrm>
+                      <a:off x="0" y="0"/>
+                      <a:ext cx="4953000" cy="5524500"/>
+                    </a:xfrm>
+                    <a:prstGeom prst="rect">
+                      <a:avLst/>
+                    </a:prstGeom>
+                  </pic:spPr>
+                </pic:pic>
+              </a:graphicData>
+            </a:graphic>
+          </wp:inline>
+        </w:drawing>
+      </w:r>
+    </w:p>
+    <w:p>
+      <w:pPr>
+        <w:spacing w:after="140"/>
+        <w:jc w:val="center"/>
+      </w:pPr>
+      <w:r>
+        <w:rPr>
+          <w:i/>
+          <w:iCs/>
+          <w:color w:val="5B6678"/>
+          <w:sz w:val="16"/>
+          <w:szCs w:val="16"/>
+        </w:rPr>
+        <w:t xml:space="preserve">Fix &amp; Flip – kompletter Lebenszyklus vom Ankauf bis zum Verkauf</w:t>
+      </w:r>
+    </w:p>
+    <w:p>
+      <w:pPr>
+        <w:spacing w:after="40"/>
+      </w:pPr>
+      <w:r>
+        <w:rPr>
+          <w:sz w:val="20"/>
+          <w:szCs w:val="20"/>
+        </w:rPr>
+        <w:t xml:space="preserve">Kurzzeitvermietung: Plattform-Abrechnungen (Airbnb/Booking) in den Belegen, Umsatzsteuer in der Steuer.</w:t>
+      </w:r>
+    </w:p>
+    <w:p>
+      <w:pPr>
+        <w:keepNext/>
+        <w:keepLines/>
+        <w:spacing w:after="60" w:before="80"/>
+        <w:jc w:val="center"/>
+      </w:pPr>
+      <w:r>
+        <w:drawing>
+          <wp:inline distT="0" distB="0" distL="0" distR="0">
+            <wp:extent cx="4953000" cy="3762375"/>
+            <wp:effectExtent t="0" r="0" b="0" l="0"/>
+            <wp:docPr id="1" name="finder" descr="macOS Finder Beispielansicht der Ordnerstruktur" title="Finder-Beispiel"/>
+            <wp:cNvGraphicFramePr>
+              <a:graphicFrameLocks xmlns:a="http://schemas.openxmlformats.org/drawingml/2006/main" noChangeAspect="1"/>
+            </wp:cNvGraphicFramePr>
+            <a:graphic xmlns:a="http://schemas.openxmlformats.org/drawingml/2006/main">
+              <a:graphicData uri="http://schemas.openxmlformats.org/drawingml/2006/picture">
+                <pic:pic xmlns:pic="http://schemas.openxmlformats.org/drawingml/2006/picture">
+                  <pic:nvPicPr>
+                    <pic:cNvPr id="0" name="" descr=""/>
+                    <pic:cNvPicPr>
+                      <a:picLocks noChangeAspect="1" noChangeArrowheads="1"/>
+                    </pic:cNvPicPr>
+                  </pic:nvPicPr>
+                  <pic:blipFill>
+                    <a:blip r:embed="rId12" cstate="none"/>
+                    <a:srcRect/>
+                    <a:stretch>
+                      <a:fillRect/>
+                    </a:stretch>
+                  </pic:blipFill>
+                  <pic:spPr bwMode="auto">
+                    <a:xfrm>
+                      <a:off x="0" y="0"/>
+                      <a:ext cx="4953000" cy="3762375"/>
+                    </a:xfrm>
+                    <a:prstGeom prst="rect">
+                      <a:avLst/>
+                    </a:prstGeom>
+                  </pic:spPr>
+                </pic:pic>
+              </a:graphicData>
+            </a:graphic>
+          </wp:inline>
+        </w:drawing>
+      </w:r>
+    </w:p>
+    <w:p>
+      <w:pPr>
+        <w:spacing w:after="140"/>
+        <w:jc w:val="center"/>
+      </w:pPr>
+      <w:r>
+        <w:rPr>
+          <w:i/>
+          <w:iCs/>
+          <w:color w:val="5B6678"/>
+          <w:sz w:val="16"/>
+          <w:szCs w:val="16"/>
+        </w:rPr>
+        <w:t xml:space="preserve">Kurzzeitvermietung – mit Umsatzsteuer und Plattform-Abrechnungen</w:t>
+      </w:r>
+    </w:p>
+    <w:p>
+      <w:pPr>
+        <w:pStyle w:val="Heading1"/>
+      </w:pPr>
+      <w:r>
+        <w:t xml:space="preserve">Kürzel-Regeln</w:t>
+      </w:r>
+    </w:p>
+    <w:p>
+      <w:pPr>
+        <w:spacing w:after="120"/>
+      </w:pPr>
+      <w:r>
+        <w:rPr>
+          <w:sz w:val="22"/>
+          <w:szCs w:val="22"/>
+        </w:rPr>
+        <w:t xml:space="preserve">Kurze Objekt-Kürzel wie B8 oder A19 – schnell getippt, eindeutig im Gespräch und in der Buchhaltung. Drei Regeln halten sie sauber:</w:t>
+      </w:r>
+    </w:p>
+    <w:p>
+      <w:pPr>
+        <w:pStyle w:val="ListParagraph"/>
+        <w:numPr>
+          <w:ilvl w:val="0"/>
+          <w:numId w:val="2"/>
+        </w:numPr>
+        <w:spacing w:after="60"/>
+      </w:pPr>
+      <w:r>
+        <w:rPr>
+          <w:b/>
+          <w:bCs/>
+          <w:sz w:val="22"/>
+          <w:szCs w:val="22"/>
+        </w:rPr>
+        <w:t xml:space="preserve">Einmal vergeben = eingefroren. </w:t>
+      </w:r>
+      <w:r>
+        <w:rPr>
+          <w:sz w:val="22"/>
+          <w:szCs w:val="22"/>
+        </w:rPr>
+        <w:t xml:space="preserve">Der Erstbelegte zieht nie um; ein neues Objekt weicht aus (die Beispielstraße bleibt B8, eine später hinzukommende Bachgasse 8 wird BA8).</w:t>
+      </w:r>
+    </w:p>
+    <w:p>
+      <w:pPr>
+        <w:pStyle w:val="ListParagraph"/>
+        <w:numPr>
+          <w:ilvl w:val="0"/>
+          <w:numId w:val="2"/>
+        </w:numPr>
+        <w:spacing w:after="60"/>
+      </w:pPr>
+      <w:r>
+        <w:rPr>
+          <w:b/>
+          <w:bCs/>
+          <w:sz w:val="22"/>
+          <w:szCs w:val="22"/>
+        </w:rPr>
+        <w:t xml:space="preserve">Kollision </w:t>
+      </w:r>
+      <w:r>
+        <w:rPr>
+          <w:sz w:val="22"/>
+          <w:szCs w:val="22"/>
+        </w:rPr>
+        <w:t xml:space="preserve">= gleicher Buchstabe UND gleiche Hausnummer. B8 und B43 leben problemlos nebeneinander.</w:t>
+      </w:r>
+    </w:p>
+    <w:p>
+      <w:pPr>
+        <w:pStyle w:val="ListParagraph"/>
+        <w:numPr>
+          <w:ilvl w:val="0"/>
+          <w:numId w:val="2"/>
+        </w:numPr>
+        <w:spacing w:after="60"/>
+      </w:pPr>
+      <w:r>
+        <w:rPr>
+          <w:b/>
+          <w:bCs/>
+          <w:sz w:val="22"/>
+          <w:szCs w:val="22"/>
+        </w:rPr>
+        <w:t xml:space="preserve">Register </w:t>
+      </w:r>
+      <w:r>
+        <w:rPr>
+          <w:sz w:val="22"/>
+          <w:szCs w:val="22"/>
+        </w:rPr>
+        <w:t xml:space="preserve">ist die einzige Wahrheit – eine Tabelle löst jedes Kürzel auf (A19 → Am Anger 19, Musterstadt).</w:t>
+      </w:r>
+    </w:p>
+    <w:p>
+      <w:pPr>
+        <w:pStyle w:val="Heading1"/>
+      </w:pPr>
+      <w:r>
+        <w:t xml:space="preserve">Dateinamen</w:t>
+      </w:r>
+    </w:p>
+    <w:p>
+      <w:pPr>
+        <w:spacing w:after="100"/>
+      </w:pPr>
+      <w:r>
+        <w:rPr>
+          <w:sz w:val="22"/>
+          <w:szCs w:val="22"/>
+        </w:rPr>
+        <w:t xml:space="preserve">Einheitlich, mit Datum vorn – dann sortiert und findet sich alles von selbst:</w:t>
+      </w:r>
+    </w:p>
     <w:tbl>
       <w:tblPr>
         <w:tblW w:type="dxa" w:w="9026"/>
@@ -1494,334 +1799,6 @@
                 <w:sz w:val="18"/>
                 <w:szCs w:val="18"/>
               </w:rPr>
-              <w:t xml:space="preserve">04_Einheiten/</w:t>
-            </w:r>
-          </w:p>
-          <w:p>
-            <w:pPr>
-              <w:spacing w:after="0" w:line="240"/>
-            </w:pPr>
-            <w:r>
-              <w:rPr>
-                <w:rFonts w:ascii="Consolas" w:cs="Consolas" w:eastAsia="Consolas" w:hAnsi="Consolas"/>
-                <w:color w:val="2C3340"/>
-                <w:sz w:val="18"/>
-                <w:szCs w:val="18"/>
-              </w:rPr>
-              <w:t xml:space="preserve">└── WE1 EG-links/</w:t>
-            </w:r>
-          </w:p>
-          <w:p>
-            <w:pPr>
-              <w:spacing w:after="0" w:line="240"/>
-            </w:pPr>
-            <w:r>
-              <w:rPr>
-                <w:rFonts w:ascii="Consolas" w:cs="Consolas" w:eastAsia="Consolas" w:hAnsi="Consolas"/>
-                <w:color w:val="2C3340"/>
-                <w:sz w:val="18"/>
-                <w:szCs w:val="18"/>
-              </w:rPr>
-              <w:t xml:space="preserve">    ├── _Wohnungsdaten/             Grundriss, Zählernummern, Schlüsselplan</w:t>
-            </w:r>
-          </w:p>
-          <w:p>
-            <w:pPr>
-              <w:spacing w:after="0" w:line="240"/>
-            </w:pPr>
-            <w:r>
-              <w:rPr>
-                <w:rFonts w:ascii="Consolas" w:cs="Consolas" w:eastAsia="Consolas" w:hAnsi="Consolas"/>
-                <w:color w:val="2C3340"/>
-                <w:sz w:val="18"/>
-                <w:szCs w:val="18"/>
-              </w:rPr>
-              <w:t xml:space="preserve">    ├── 2025-11 – heute · Müller/    aktueller Mieter (Ende offen)</w:t>
-            </w:r>
-          </w:p>
-          <w:p>
-            <w:pPr>
-              <w:spacing w:after="0" w:line="240"/>
-            </w:pPr>
-            <w:r>
-              <w:rPr>
-                <w:rFonts w:ascii="Consolas" w:cs="Consolas" w:eastAsia="Consolas" w:hAnsi="Consolas"/>
-                <w:color w:val="2C3340"/>
-                <w:sz w:val="18"/>
-                <w:szCs w:val="18"/>
-              </w:rPr>
-              <w:t xml:space="preserve">    ├── 2018-03 – 2025-09 · Schmidt/</w:t>
-            </w:r>
-          </w:p>
-          <w:p>
-            <w:pPr>
-              <w:spacing w:after="0" w:line="240"/>
-            </w:pPr>
-            <w:r>
-              <w:rPr>
-                <w:rFonts w:ascii="Consolas" w:cs="Consolas" w:eastAsia="Consolas" w:hAnsi="Consolas"/>
-                <w:color w:val="2C3340"/>
-                <w:sz w:val="18"/>
-                <w:szCs w:val="18"/>
-              </w:rPr>
-              <w:t xml:space="preserve">    └── 2015-05 – 2018-02 · Meier/</w:t>
-            </w:r>
-          </w:p>
-        </w:tc>
-      </w:tr>
-    </w:tbl>
-    <w:p>
-      <w:pPr>
-        <w:spacing w:after="80"/>
-      </w:pPr>
-      <w:r>
-        <w:rPr>
-          <w:sz w:val="22"/>
-          <w:szCs w:val="22"/>
-        </w:rPr>
-        <w:t xml:space="preserve">Pro Mieter-Ordner: Mietvertrag, Selbstauskunft/Bonität, Kaution, Übergabe (Ein+Aus), Mieterhöhungen, Korrespondenz.</w:t>
-      </w:r>
-    </w:p>
-    <w:p>
-      <w:pPr>
-        <w:pStyle w:val="ListParagraph"/>
-        <w:numPr>
-          <w:ilvl w:val="0"/>
-          <w:numId w:val="2"/>
-        </w:numPr>
-        <w:spacing w:after="60"/>
-      </w:pPr>
-      <w:r>
-        <w:rPr>
-          <w:b/>
-          <w:bCs/>
-          <w:sz w:val="22"/>
-          <w:szCs w:val="22"/>
-        </w:rPr>
-        <w:t xml:space="preserve">Benennung: </w:t>
-      </w:r>
-      <w:r>
-        <w:rPr>
-          <w:sz w:val="22"/>
-          <w:szCs w:val="22"/>
-        </w:rPr>
-        <w:t xml:space="preserve">JJJJ-MM – heute · Name (aktueller Mieter), JJJJ-MM – JJJJ-MM · Name (Vormieter). Das Wort „heute“ markiert den aktuellen Mieter.</w:t>
-      </w:r>
-    </w:p>
-    <w:p>
-      <w:pPr>
-        <w:pStyle w:val="ListParagraph"/>
-        <w:numPr>
-          <w:ilvl w:val="0"/>
-          <w:numId w:val="2"/>
-        </w:numPr>
-        <w:spacing w:after="60"/>
-      </w:pPr>
-      <w:r>
-        <w:rPr>
-          <w:b/>
-          <w:bCs/>
-          <w:sz w:val="22"/>
-          <w:szCs w:val="22"/>
-        </w:rPr>
-        <w:t xml:space="preserve">Mieterwechsel = 2 Handgriffe: </w:t>
-      </w:r>
-      <w:r>
-        <w:rPr>
-          <w:sz w:val="22"/>
-          <w:szCs w:val="22"/>
-        </w:rPr>
-        <w:t xml:space="preserve">„heute“ durch das Auszugsdatum ersetzen (Ordner bleibt liegen, nichts löschen) und neuen Mieter-Ordner anlegen.</w:t>
-      </w:r>
-    </w:p>
-    <w:p>
-      <w:pPr>
-        <w:pStyle w:val="ListParagraph"/>
-        <w:numPr>
-          <w:ilvl w:val="0"/>
-          <w:numId w:val="2"/>
-        </w:numPr>
-        <w:spacing w:after="60"/>
-      </w:pPr>
-      <w:r>
-        <w:rPr>
-          <w:b/>
-          <w:bCs/>
-          <w:sz w:val="22"/>
-          <w:szCs w:val="22"/>
-        </w:rPr>
-        <w:t xml:space="preserve">Belege bleiben in 06_Belege: </w:t>
-      </w:r>
-      <w:r>
-        <w:rPr>
-          <w:sz w:val="22"/>
-          <w:szCs w:val="22"/>
-        </w:rPr>
-        <w:t xml:space="preserve">Rechnungen – auch Renovierung nach Auszug – gehören zur Buchhaltung/Steuer, nicht in den Mieter-Ordner.</w:t>
-      </w:r>
-    </w:p>
-    <w:p>
-      <w:pPr>
-        <w:pStyle w:val="Heading1"/>
-      </w:pPr>
-      <w:r>
-        <w:t xml:space="preserve">Kürzel-Regeln</w:t>
-      </w:r>
-    </w:p>
-    <w:p>
-      <w:pPr>
-        <w:spacing w:after="120"/>
-      </w:pPr>
-      <w:r>
-        <w:rPr>
-          <w:sz w:val="22"/>
-          <w:szCs w:val="22"/>
-        </w:rPr>
-        <w:t xml:space="preserve">Kurze Objekt-Kürzel wie B8 oder A19 – schnell getippt, eindeutig im Gespräch und in der Buchhaltung. Drei Regeln halten sie sauber:</w:t>
-      </w:r>
-    </w:p>
-    <w:p>
-      <w:pPr>
-        <w:pStyle w:val="ListParagraph"/>
-        <w:numPr>
-          <w:ilvl w:val="0"/>
-          <w:numId w:val="2"/>
-        </w:numPr>
-        <w:spacing w:after="60"/>
-      </w:pPr>
-      <w:r>
-        <w:rPr>
-          <w:b/>
-          <w:bCs/>
-          <w:sz w:val="22"/>
-          <w:szCs w:val="22"/>
-        </w:rPr>
-        <w:t xml:space="preserve">Einmal vergeben = eingefroren. </w:t>
-      </w:r>
-      <w:r>
-        <w:rPr>
-          <w:sz w:val="22"/>
-          <w:szCs w:val="22"/>
-        </w:rPr>
-        <w:t xml:space="preserve">Der Erstbelegte zieht nie um; ein neues Objekt weicht aus (die Beispielstraße bleibt B8, eine später hinzukommende Bachgasse 8 wird BA8).</w:t>
-      </w:r>
-    </w:p>
-    <w:p>
-      <w:pPr>
-        <w:pStyle w:val="ListParagraph"/>
-        <w:numPr>
-          <w:ilvl w:val="0"/>
-          <w:numId w:val="2"/>
-        </w:numPr>
-        <w:spacing w:after="60"/>
-      </w:pPr>
-      <w:r>
-        <w:rPr>
-          <w:b/>
-          <w:bCs/>
-          <w:sz w:val="22"/>
-          <w:szCs w:val="22"/>
-        </w:rPr>
-        <w:t xml:space="preserve">Kollision </w:t>
-      </w:r>
-      <w:r>
-        <w:rPr>
-          <w:sz w:val="22"/>
-          <w:szCs w:val="22"/>
-        </w:rPr>
-        <w:t xml:space="preserve">= gleicher Buchstabe UND gleiche Hausnummer. B8 und B43 leben problemlos nebeneinander.</w:t>
-      </w:r>
-    </w:p>
-    <w:p>
-      <w:pPr>
-        <w:pStyle w:val="ListParagraph"/>
-        <w:numPr>
-          <w:ilvl w:val="0"/>
-          <w:numId w:val="2"/>
-        </w:numPr>
-        <w:spacing w:after="60"/>
-      </w:pPr>
-      <w:r>
-        <w:rPr>
-          <w:b/>
-          <w:bCs/>
-          <w:sz w:val="22"/>
-          <w:szCs w:val="22"/>
-        </w:rPr>
-        <w:t xml:space="preserve">Register </w:t>
-      </w:r>
-      <w:r>
-        <w:rPr>
-          <w:sz w:val="22"/>
-          <w:szCs w:val="22"/>
-        </w:rPr>
-        <w:t xml:space="preserve">ist die einzige Wahrheit – eine Tabelle löst jedes Kürzel auf (A19 → Am Anger 19, Musterstadt).</w:t>
-      </w:r>
-    </w:p>
-    <w:p>
-      <w:pPr>
-        <w:pStyle w:val="Heading1"/>
-      </w:pPr>
-      <w:r>
-        <w:t xml:space="preserve">Dateinamen</w:t>
-      </w:r>
-    </w:p>
-    <w:p>
-      <w:pPr>
-        <w:spacing w:after="100"/>
-      </w:pPr>
-      <w:r>
-        <w:rPr>
-          <w:sz w:val="22"/>
-          <w:szCs w:val="22"/>
-        </w:rPr>
-        <w:t xml:space="preserve">Einheitlich, mit Datum vorn – dann sortiert und findet sich alles von selbst:</w:t>
-      </w:r>
-    </w:p>
-    <w:tbl>
-      <w:tblPr>
-        <w:tblW w:type="dxa" w:w="9026"/>
-        <w:tblBorders>
-          <w:top w:val="single" w:color="auto" w:sz="4"/>
-          <w:left w:val="single" w:color="auto" w:sz="4"/>
-          <w:bottom w:val="single" w:color="auto" w:sz="4"/>
-          <w:right w:val="single" w:color="auto" w:sz="4"/>
-          <w:insideH w:val="single" w:color="auto" w:sz="4"/>
-          <w:insideV w:val="single" w:color="auto" w:sz="4"/>
-        </w:tblBorders>
-      </w:tblPr>
-      <w:tblGrid>
-        <w:gridCol w:w="9026"/>
-      </w:tblGrid>
-      <w:tr>
-        <w:tc>
-          <w:tcPr>
-            <w:tcW w:type="dxa" w:w="9026"/>
-            <w:tcBorders>
-              <w:top w:val="single" w:color="D9DEE8" w:sz="4"/>
-              <w:left w:val="single" w:color="D9DEE8" w:sz="4"/>
-              <w:bottom w:val="single" w:color="D9DEE8" w:sz="4"/>
-              <w:right w:val="single" w:color="D9DEE8" w:sz="4"/>
-            </w:tcBorders>
-            <w:shd w:fill="F2F4F8" w:val="clear"/>
-            <w:tcMar>
-              <w:top w:type="dxa" w:w="160"/>
-              <w:left w:type="dxa" w:w="200"/>
-              <w:bottom w:type="dxa" w:w="160"/>
-              <w:right w:type="dxa" w:w="160"/>
-            </w:tcMar>
-          </w:tcPr>
-          <w:p>
-            <w:pPr>
-              <w:spacing w:after="0" w:line="240"/>
-            </w:pPr>
-            <w:r>
-              <w:rPr>
-                <w:rFonts w:ascii="Consolas" w:cs="Consolas" w:eastAsia="Consolas" w:hAnsi="Consolas"/>
-                <w:color w:val="2C3340"/>
-                <w:sz w:val="18"/>
-                <w:szCs w:val="18"/>
-              </w:rPr>
               <w:t xml:space="preserve">JJJJ-MM-TT_Typ_Beschreibung</w:t>
             </w:r>
           </w:p>
@@ -2000,7 +1977,7 @@
         </w:rPr>
         <w:t xml:space="preserve">immoJUMP nutzen: </w:t>
       </w:r>
-      <w:hyperlink w:history="1" r:id="rIdjdraairxcl07fvv1df1rk">
+      <w:hyperlink w:history="1" r:id="rId5ss8wyew0cvymetco1q7r">
         <w:r>
           <w:rPr>
             <w:rStyle w:val="Hyperlink"/>
@@ -2018,7 +1995,7 @@
         </w:rPr>
         <w:t xml:space="preserve">   ·   Mehr erfahren: </w:t>
       </w:r>
-      <w:hyperlink w:history="1" r:id="rIdoeu_t1hhv53vzxg5yxwxc">
+      <w:hyperlink w:history="1" r:id="rIdzpdkxjp5e5vsgtmyq8a2n">
         <w:r>
           <w:rPr>
             <w:rStyle w:val="Hyperlink"/>
@@ -2036,7 +2013,7 @@
         </w:rPr>
         <w:t xml:space="preserve">   ·   </w:t>
       </w:r>
-      <w:hyperlink w:history="1" r:id="rIdsuyxgisy8wpspcqh1obhg">
+      <w:hyperlink w:history="1" r:id="rId9s_ixilgxpcyodbuw9n8g">
         <w:r>
           <w:rPr>
             <w:rStyle w:val="Hyperlink"/>

</xml_diff>

<commit_message>
feat(docs): Top-Ebene als Bild + Einsteiger/ETW-Anwendungsfall
Schwer lesbaren Erklaersatz durch Finder-Screenshot der obersten Ebene ersetzt.
Neuer Hinweis + Beispiel fuer Einzelwohnungs-Kaeufer (ETW ohne Firmen-Ebene, mit
WEG-Unterlagen) in HTML (4. Use-Case in Seitenleiste), Word/PDF und WordPress-Beitrag.

Co-Authored-By: Claude Opus 4.8 <noreply@anthropic.com>
</commit_message>
<xml_diff>
--- a/docs/Immobilien-Ablage-Ordnerstruktur.docx
+++ b/docs/Immobilien-Ablage-Ordnerstruktur.docx
@@ -420,14 +420,14 @@
     </w:p>
     <w:p>
       <w:pPr>
-        <w:spacing w:after="60"/>
+        <w:spacing w:after="40"/>
       </w:pPr>
       <w:r>
         <w:rPr>
           <w:sz w:val="22"/>
           <w:szCs w:val="22"/>
         </w:rPr>
-        <w:t xml:space="preserve">Am Stamm liegen 00_Vorlagen und 00_Portfolio (Kürzel-Register), darunter pro Halteform 0_Ankauf / 1_Bestand / 2_Verkauft. Jedes Objekt im Bestand folgt derselben Struktur 00–09 – hier ein Mehrfamilienhaus:</w:t>
+        <w:t xml:space="preserve">Ganz oben sortierst du nach Firma bzw. Eigentümer – darunter nach Ankauf, Bestand und Verkauf:</w:t>
       </w:r>
     </w:p>
     <w:p>
@@ -440,7 +440,7 @@
       <w:r>
         <w:drawing>
           <wp:inline distT="0" distB="0" distL="0" distR="0">
-            <wp:extent cx="5143500" cy="3524250"/>
+            <wp:extent cx="4953000" cy="3381375"/>
             <wp:effectExtent t="0" r="0" b="0" l="0"/>
             <wp:docPr id="1" name="finder" descr="macOS Finder Beispielansicht der Ordnerstruktur" title="Finder-Beispiel"/>
             <wp:cNvGraphicFramePr>
@@ -465,7 +465,7 @@
                   <pic:spPr bwMode="auto">
                     <a:xfrm>
                       <a:off x="0" y="0"/>
-                      <a:ext cx="5143500" cy="3524250"/>
+                      <a:ext cx="4953000" cy="3381375"/>
                     </a:xfrm>
                     <a:prstGeom prst="rect">
                       <a:avLst/>
@@ -491,823 +491,19 @@
           <w:sz w:val="16"/>
           <w:szCs w:val="16"/>
         </w:rPr>
-        <w:t xml:space="preserve">Beispielobjekt im Bestand – Buy &amp; Hold</w:t>
-      </w:r>
-    </w:p>
-    <w:p>
-      <w:pPr>
-        <w:pStyle w:val="Heading1"/>
-        <w:pageBreakBefore/>
-      </w:pPr>
-      <w:r>
-        <w:t xml:space="preserve">Die Objekt-Vorlage (00–09)</w:t>
-      </w:r>
-    </w:p>
-    <w:p>
-      <w:pPr>
-        <w:spacing w:after="120"/>
+        <w:t xml:space="preserve">Die oberste Ebene – nach Eigentümer und Status sortiert</w:t>
+      </w:r>
+    </w:p>
+    <w:p>
+      <w:pPr>
+        <w:spacing w:after="40"/>
       </w:pPr>
       <w:r>
         <w:rPr>
           <w:sz w:val="22"/>
           <w:szCs w:val="22"/>
         </w:rPr>
-        <w:t xml:space="preserve">Eine einzige Vorlage für jedes Objekt. Gleiche Struktur überall – man findet sich auf jedem Objekt sofort zurecht.</w:t>
-      </w:r>
-    </w:p>
-    <w:tbl>
-      <w:tblPr>
-        <w:tblW w:type="dxa" w:w="9026"/>
-        <w:tblBorders>
-          <w:top w:val="single" w:color="auto" w:sz="4"/>
-          <w:left w:val="single" w:color="auto" w:sz="4"/>
-          <w:bottom w:val="single" w:color="auto" w:sz="4"/>
-          <w:right w:val="single" w:color="auto" w:sz="4"/>
-          <w:insideH w:val="single" w:color="auto" w:sz="4"/>
-          <w:insideV w:val="single" w:color="auto" w:sz="4"/>
-        </w:tblBorders>
-      </w:tblPr>
-      <w:tblGrid>
-        <w:gridCol w:w="2400"/>
-        <w:gridCol w:w="6626"/>
-      </w:tblGrid>
-      <w:tr>
-        <w:tc>
-          <w:tcPr>
-            <w:tcW w:type="dxa" w:w="2400"/>
-            <w:tcBorders>
-              <w:top w:val="single" w:color="D9DEE8" w:sz="4"/>
-              <w:left w:val="single" w:color="D9DEE8" w:sz="4"/>
-              <w:bottom w:val="single" w:color="D9DEE8" w:sz="4"/>
-              <w:right w:val="single" w:color="D9DEE8" w:sz="4"/>
-            </w:tcBorders>
-            <w:shd w:fill="1F4E79" w:val="clear"/>
-            <w:tcMar>
-              <w:top w:type="dxa" w:w="90"/>
-              <w:left w:type="dxa" w:w="140"/>
-              <w:bottom w:type="dxa" w:w="90"/>
-              <w:right w:type="dxa" w:w="120"/>
-            </w:tcMar>
-          </w:tcPr>
-          <w:p>
-            <w:pPr>
-              <w:spacing w:after="0"/>
-            </w:pPr>
-            <w:r>
-              <w:rPr>
-                <w:b/>
-                <w:bCs/>
-                <w:color w:val="FFFFFF"/>
-                <w:sz w:val="20"/>
-                <w:szCs w:val="20"/>
-              </w:rPr>
-              <w:t xml:space="preserve">Ordner</w:t>
-            </w:r>
-          </w:p>
-        </w:tc>
-        <w:tc>
-          <w:tcPr>
-            <w:tcW w:type="dxa" w:w="6626"/>
-            <w:tcBorders>
-              <w:top w:val="single" w:color="D9DEE8" w:sz="4"/>
-              <w:left w:val="single" w:color="D9DEE8" w:sz="4"/>
-              <w:bottom w:val="single" w:color="D9DEE8" w:sz="4"/>
-              <w:right w:val="single" w:color="D9DEE8" w:sz="4"/>
-            </w:tcBorders>
-            <w:shd w:fill="1F4E79" w:val="clear"/>
-            <w:tcMar>
-              <w:top w:type="dxa" w:w="90"/>
-              <w:left w:type="dxa" w:w="140"/>
-              <w:bottom w:type="dxa" w:w="90"/>
-              <w:right w:type="dxa" w:w="120"/>
-            </w:tcMar>
-          </w:tcPr>
-          <w:p>
-            <w:pPr>
-              <w:spacing w:after="0"/>
-            </w:pPr>
-            <w:r>
-              <w:rPr>
-                <w:b/>
-                <w:bCs/>
-                <w:color w:val="FFFFFF"/>
-                <w:sz w:val="20"/>
-                <w:szCs w:val="20"/>
-              </w:rPr>
-              <w:t xml:space="preserve">Inhalt</w:t>
-            </w:r>
-          </w:p>
-        </w:tc>
-      </w:tr>
-      <w:tr>
-        <w:tc>
-          <w:tcPr>
-            <w:tcW w:type="dxa" w:w="2400"/>
-            <w:tcBorders>
-              <w:top w:val="single" w:color="D9DEE8" w:sz="4"/>
-              <w:left w:val="single" w:color="D9DEE8" w:sz="4"/>
-              <w:bottom w:val="single" w:color="D9DEE8" w:sz="4"/>
-              <w:right w:val="single" w:color="D9DEE8" w:sz="4"/>
-            </w:tcBorders>
-            <w:shd w:fill="FFFFFF" w:val="clear"/>
-            <w:tcMar>
-              <w:top w:type="dxa" w:w="90"/>
-              <w:left w:type="dxa" w:w="140"/>
-              <w:bottom w:type="dxa" w:w="90"/>
-              <w:right w:type="dxa" w:w="120"/>
-            </w:tcMar>
-          </w:tcPr>
-          <w:p>
-            <w:pPr>
-              <w:spacing w:after="0"/>
-            </w:pPr>
-            <w:r>
-              <w:rPr>
-                <w:b/>
-                <w:bCs/>
-                <w:color w:val="1A2233"/>
-                <w:sz w:val="20"/>
-                <w:szCs w:val="20"/>
-              </w:rPr>
-              <w:t xml:space="preserve">00_Objektdatenblatt</w:t>
-            </w:r>
-          </w:p>
-        </w:tc>
-        <w:tc>
-          <w:tcPr>
-            <w:tcW w:type="dxa" w:w="6626"/>
-            <w:tcBorders>
-              <w:top w:val="single" w:color="D9DEE8" w:sz="4"/>
-              <w:left w:val="single" w:color="D9DEE8" w:sz="4"/>
-              <w:bottom w:val="single" w:color="D9DEE8" w:sz="4"/>
-              <w:right w:val="single" w:color="D9DEE8" w:sz="4"/>
-            </w:tcBorders>
-            <w:shd w:fill="FFFFFF" w:val="clear"/>
-            <w:tcMar>
-              <w:top w:type="dxa" w:w="90"/>
-              <w:left w:type="dxa" w:w="140"/>
-              <w:bottom w:type="dxa" w:w="90"/>
-              <w:right w:type="dxa" w:w="120"/>
-            </w:tcMar>
-          </w:tcPr>
-          <w:p>
-            <w:pPr>
-              <w:spacing w:after="0"/>
-            </w:pPr>
-            <w:r>
-              <w:rPr>
-                <w:color w:val="1A2233"/>
-                <w:sz w:val="20"/>
-                <w:szCs w:val="20"/>
-              </w:rPr>
-              <w:t xml:space="preserve">Eckdaten, Kürzel, Fläche, Baujahr, Kaufdatum, AfA-Basis, Zählernummern</w:t>
-            </w:r>
-          </w:p>
-        </w:tc>
-      </w:tr>
-      <w:tr>
-        <w:tc>
-          <w:tcPr>
-            <w:tcW w:type="dxa" w:w="2400"/>
-            <w:tcBorders>
-              <w:top w:val="single" w:color="D9DEE8" w:sz="4"/>
-              <w:left w:val="single" w:color="D9DEE8" w:sz="4"/>
-              <w:bottom w:val="single" w:color="D9DEE8" w:sz="4"/>
-              <w:right w:val="single" w:color="D9DEE8" w:sz="4"/>
-            </w:tcBorders>
-            <w:shd w:fill="FFFFFF" w:val="clear"/>
-            <w:tcMar>
-              <w:top w:type="dxa" w:w="90"/>
-              <w:left w:type="dxa" w:w="140"/>
-              <w:bottom w:type="dxa" w:w="90"/>
-              <w:right w:type="dxa" w:w="120"/>
-            </w:tcMar>
-          </w:tcPr>
-          <w:p>
-            <w:pPr>
-              <w:spacing w:after="0"/>
-            </w:pPr>
-            <w:r>
-              <w:rPr>
-                <w:b/>
-                <w:bCs/>
-                <w:color w:val="1A2233"/>
-                <w:sz w:val="20"/>
-                <w:szCs w:val="20"/>
-              </w:rPr>
-              <w:t xml:space="preserve">01_Stammdaten</w:t>
-            </w:r>
-          </w:p>
-        </w:tc>
-        <w:tc>
-          <w:tcPr>
-            <w:tcW w:type="dxa" w:w="6626"/>
-            <w:tcBorders>
-              <w:top w:val="single" w:color="D9DEE8" w:sz="4"/>
-              <w:left w:val="single" w:color="D9DEE8" w:sz="4"/>
-              <w:bottom w:val="single" w:color="D9DEE8" w:sz="4"/>
-              <w:right w:val="single" w:color="D9DEE8" w:sz="4"/>
-            </w:tcBorders>
-            <w:shd w:fill="FFFFFF" w:val="clear"/>
-            <w:tcMar>
-              <w:top w:type="dxa" w:w="90"/>
-              <w:left w:type="dxa" w:w="140"/>
-              <w:bottom w:type="dxa" w:w="90"/>
-              <w:right w:type="dxa" w:w="120"/>
-            </w:tcMar>
-          </w:tcPr>
-          <w:p>
-            <w:pPr>
-              <w:spacing w:after="0"/>
-            </w:pPr>
-            <w:r>
-              <w:rPr>
-                <w:color w:val="1A2233"/>
-                <w:sz w:val="20"/>
-                <w:szCs w:val="20"/>
-              </w:rPr>
-              <w:t xml:space="preserve">Grundbuch, Pläne, Lageplan, Wohnflächenberechnung, Energieausweis, Teilungserklärung</w:t>
-            </w:r>
-          </w:p>
-        </w:tc>
-      </w:tr>
-      <w:tr>
-        <w:tc>
-          <w:tcPr>
-            <w:tcW w:type="dxa" w:w="2400"/>
-            <w:tcBorders>
-              <w:top w:val="single" w:color="D9DEE8" w:sz="4"/>
-              <w:left w:val="single" w:color="D9DEE8" w:sz="4"/>
-              <w:bottom w:val="single" w:color="D9DEE8" w:sz="4"/>
-              <w:right w:val="single" w:color="D9DEE8" w:sz="4"/>
-            </w:tcBorders>
-            <w:shd w:fill="FFFFFF" w:val="clear"/>
-            <w:tcMar>
-              <w:top w:type="dxa" w:w="90"/>
-              <w:left w:type="dxa" w:w="140"/>
-              <w:bottom w:type="dxa" w:w="90"/>
-              <w:right w:type="dxa" w:w="120"/>
-            </w:tcMar>
-          </w:tcPr>
-          <w:p>
-            <w:pPr>
-              <w:spacing w:after="0"/>
-            </w:pPr>
-            <w:r>
-              <w:rPr>
-                <w:b/>
-                <w:bCs/>
-                <w:color w:val="1A2233"/>
-                <w:sz w:val="20"/>
-                <w:szCs w:val="20"/>
-              </w:rPr>
-              <w:t xml:space="preserve">02_Kaufprozess</w:t>
-            </w:r>
-          </w:p>
-        </w:tc>
-        <w:tc>
-          <w:tcPr>
-            <w:tcW w:type="dxa" w:w="6626"/>
-            <w:tcBorders>
-              <w:top w:val="single" w:color="D9DEE8" w:sz="4"/>
-              <w:left w:val="single" w:color="D9DEE8" w:sz="4"/>
-              <w:bottom w:val="single" w:color="D9DEE8" w:sz="4"/>
-              <w:right w:val="single" w:color="D9DEE8" w:sz="4"/>
-            </w:tcBorders>
-            <w:shd w:fill="FFFFFF" w:val="clear"/>
-            <w:tcMar>
-              <w:top w:type="dxa" w:w="90"/>
-              <w:left w:type="dxa" w:w="140"/>
-              <w:bottom w:type="dxa" w:w="90"/>
-              <w:right w:type="dxa" w:w="120"/>
-            </w:tcMar>
-          </w:tcPr>
-          <w:p>
-            <w:pPr>
-              <w:spacing w:after="0"/>
-            </w:pPr>
-            <w:r>
-              <w:rPr>
-                <w:color w:val="1A2233"/>
-                <w:sz w:val="20"/>
-                <w:szCs w:val="20"/>
-              </w:rPr>
-              <w:t xml:space="preserve">Exposé, Notar/Kaufvertrag, Kaufpreisaufteilung, Kaufnebenkosten</w:t>
-            </w:r>
-          </w:p>
-        </w:tc>
-      </w:tr>
-      <w:tr>
-        <w:tc>
-          <w:tcPr>
-            <w:tcW w:type="dxa" w:w="2400"/>
-            <w:tcBorders>
-              <w:top w:val="single" w:color="D9DEE8" w:sz="4"/>
-              <w:left w:val="single" w:color="D9DEE8" w:sz="4"/>
-              <w:bottom w:val="single" w:color="D9DEE8" w:sz="4"/>
-              <w:right w:val="single" w:color="D9DEE8" w:sz="4"/>
-            </w:tcBorders>
-            <w:shd w:fill="FFFFFF" w:val="clear"/>
-            <w:tcMar>
-              <w:top w:type="dxa" w:w="90"/>
-              <w:left w:type="dxa" w:w="140"/>
-              <w:bottom w:type="dxa" w:w="90"/>
-              <w:right w:type="dxa" w:w="120"/>
-            </w:tcMar>
-          </w:tcPr>
-          <w:p>
-            <w:pPr>
-              <w:spacing w:after="0"/>
-            </w:pPr>
-            <w:r>
-              <w:rPr>
-                <w:b/>
-                <w:bCs/>
-                <w:color w:val="1A2233"/>
-                <w:sz w:val="20"/>
-                <w:szCs w:val="20"/>
-              </w:rPr>
-              <w:t xml:space="preserve">03_Finanzierung</w:t>
-            </w:r>
-          </w:p>
-        </w:tc>
-        <w:tc>
-          <w:tcPr>
-            <w:tcW w:type="dxa" w:w="6626"/>
-            <w:tcBorders>
-              <w:top w:val="single" w:color="D9DEE8" w:sz="4"/>
-              <w:left w:val="single" w:color="D9DEE8" w:sz="4"/>
-              <w:bottom w:val="single" w:color="D9DEE8" w:sz="4"/>
-              <w:right w:val="single" w:color="D9DEE8" w:sz="4"/>
-            </w:tcBorders>
-            <w:shd w:fill="FFFFFF" w:val="clear"/>
-            <w:tcMar>
-              <w:top w:type="dxa" w:w="90"/>
-              <w:left w:type="dxa" w:w="140"/>
-              <w:bottom w:type="dxa" w:w="90"/>
-              <w:right w:type="dxa" w:w="120"/>
-            </w:tcMar>
-          </w:tcPr>
-          <w:p>
-            <w:pPr>
-              <w:spacing w:after="0"/>
-            </w:pPr>
-            <w:r>
-              <w:rPr>
-                <w:color w:val="1A2233"/>
-                <w:sz w:val="20"/>
-                <w:szCs w:val="20"/>
-              </w:rPr>
-              <w:t xml:space="preserve">Darlehensverträge, Grundschuld, Tilgungspläne, Zinsbescheinigungen</w:t>
-            </w:r>
-          </w:p>
-        </w:tc>
-      </w:tr>
-      <w:tr>
-        <w:tc>
-          <w:tcPr>
-            <w:tcW w:type="dxa" w:w="2400"/>
-            <w:tcBorders>
-              <w:top w:val="single" w:color="D9DEE8" w:sz="4"/>
-              <w:left w:val="single" w:color="D9DEE8" w:sz="4"/>
-              <w:bottom w:val="single" w:color="D9DEE8" w:sz="4"/>
-              <w:right w:val="single" w:color="D9DEE8" w:sz="4"/>
-            </w:tcBorders>
-            <w:shd w:fill="FFFFFF" w:val="clear"/>
-            <w:tcMar>
-              <w:top w:type="dxa" w:w="90"/>
-              <w:left w:type="dxa" w:w="140"/>
-              <w:bottom w:type="dxa" w:w="90"/>
-              <w:right w:type="dxa" w:w="120"/>
-            </w:tcMar>
-          </w:tcPr>
-          <w:p>
-            <w:pPr>
-              <w:spacing w:after="0"/>
-            </w:pPr>
-            <w:r>
-              <w:rPr>
-                <w:b/>
-                <w:bCs/>
-                <w:color w:val="1A2233"/>
-                <w:sz w:val="20"/>
-                <w:szCs w:val="20"/>
-              </w:rPr>
-              <w:t xml:space="preserve">04_Einheiten</w:t>
-            </w:r>
-          </w:p>
-        </w:tc>
-        <w:tc>
-          <w:tcPr>
-            <w:tcW w:type="dxa" w:w="6626"/>
-            <w:tcBorders>
-              <w:top w:val="single" w:color="D9DEE8" w:sz="4"/>
-              <w:left w:val="single" w:color="D9DEE8" w:sz="4"/>
-              <w:bottom w:val="single" w:color="D9DEE8" w:sz="4"/>
-              <w:right w:val="single" w:color="D9DEE8" w:sz="4"/>
-            </w:tcBorders>
-            <w:shd w:fill="FFFFFF" w:val="clear"/>
-            <w:tcMar>
-              <w:top w:type="dxa" w:w="90"/>
-              <w:left w:type="dxa" w:w="140"/>
-              <w:bottom w:type="dxa" w:w="90"/>
-              <w:right w:type="dxa" w:w="120"/>
-            </w:tcMar>
-          </w:tcPr>
-          <w:p>
-            <w:pPr>
-              <w:spacing w:after="0"/>
-            </w:pPr>
-            <w:r>
-              <w:rPr>
-                <w:color w:val="1A2233"/>
-                <w:sz w:val="20"/>
-                <w:szCs w:val="20"/>
-              </w:rPr>
-              <w:t xml:space="preserve">Je Wohnung ein Ordner mit Mieter-Chronik (s.u.): pro Mieter eine datierte Mietakte</w:t>
-            </w:r>
-          </w:p>
-        </w:tc>
-      </w:tr>
-      <w:tr>
-        <w:tc>
-          <w:tcPr>
-            <w:tcW w:type="dxa" w:w="2400"/>
-            <w:tcBorders>
-              <w:top w:val="single" w:color="D9DEE8" w:sz="4"/>
-              <w:left w:val="single" w:color="D9DEE8" w:sz="4"/>
-              <w:bottom w:val="single" w:color="D9DEE8" w:sz="4"/>
-              <w:right w:val="single" w:color="D9DEE8" w:sz="4"/>
-            </w:tcBorders>
-            <w:shd w:fill="FFFFFF" w:val="clear"/>
-            <w:tcMar>
-              <w:top w:type="dxa" w:w="90"/>
-              <w:left w:type="dxa" w:w="140"/>
-              <w:bottom w:type="dxa" w:w="90"/>
-              <w:right w:type="dxa" w:w="120"/>
-            </w:tcMar>
-          </w:tcPr>
-          <w:p>
-            <w:pPr>
-              <w:spacing w:after="0"/>
-            </w:pPr>
-            <w:r>
-              <w:rPr>
-                <w:b/>
-                <w:bCs/>
-                <w:color w:val="1A2233"/>
-                <w:sz w:val="20"/>
-                <w:szCs w:val="20"/>
-              </w:rPr>
-              <w:t xml:space="preserve">05_Verwaltung</w:t>
-            </w:r>
-          </w:p>
-        </w:tc>
-        <w:tc>
-          <w:tcPr>
-            <w:tcW w:type="dxa" w:w="6626"/>
-            <w:tcBorders>
-              <w:top w:val="single" w:color="D9DEE8" w:sz="4"/>
-              <w:left w:val="single" w:color="D9DEE8" w:sz="4"/>
-              <w:bottom w:val="single" w:color="D9DEE8" w:sz="4"/>
-              <w:right w:val="single" w:color="D9DEE8" w:sz="4"/>
-            </w:tcBorders>
-            <w:shd w:fill="FFFFFF" w:val="clear"/>
-            <w:tcMar>
-              <w:top w:type="dxa" w:w="90"/>
-              <w:left w:type="dxa" w:w="140"/>
-              <w:bottom w:type="dxa" w:w="90"/>
-              <w:right w:type="dxa" w:w="120"/>
-            </w:tcMar>
-          </w:tcPr>
-          <w:p>
-            <w:pPr>
-              <w:spacing w:after="0"/>
-            </w:pPr>
-            <w:r>
-              <w:rPr>
-                <w:color w:val="1A2233"/>
-                <w:sz w:val="20"/>
-                <w:szCs w:val="20"/>
-              </w:rPr>
-              <w:t xml:space="preserve">Versicherung, Grundsteuer, Reparaturen, Modernisierung, Zählerstände, Fotos, WEG</w:t>
-            </w:r>
-          </w:p>
-        </w:tc>
-      </w:tr>
-      <w:tr>
-        <w:tc>
-          <w:tcPr>
-            <w:tcW w:type="dxa" w:w="2400"/>
-            <w:tcBorders>
-              <w:top w:val="single" w:color="D9DEE8" w:sz="4"/>
-              <w:left w:val="single" w:color="D9DEE8" w:sz="4"/>
-              <w:bottom w:val="single" w:color="D9DEE8" w:sz="4"/>
-              <w:right w:val="single" w:color="D9DEE8" w:sz="4"/>
-            </w:tcBorders>
-            <w:shd w:fill="FFFFFF" w:val="clear"/>
-            <w:tcMar>
-              <w:top w:type="dxa" w:w="90"/>
-              <w:left w:type="dxa" w:w="140"/>
-              <w:bottom w:type="dxa" w:w="90"/>
-              <w:right w:type="dxa" w:w="120"/>
-            </w:tcMar>
-          </w:tcPr>
-          <w:p>
-            <w:pPr>
-              <w:spacing w:after="0"/>
-            </w:pPr>
-            <w:r>
-              <w:rPr>
-                <w:b/>
-                <w:bCs/>
-                <w:color w:val="1A2233"/>
-                <w:sz w:val="20"/>
-                <w:szCs w:val="20"/>
-              </w:rPr>
-              <w:t xml:space="preserve">06_Belege</w:t>
-            </w:r>
-          </w:p>
-        </w:tc>
-        <w:tc>
-          <w:tcPr>
-            <w:tcW w:type="dxa" w:w="6626"/>
-            <w:tcBorders>
-              <w:top w:val="single" w:color="D9DEE8" w:sz="4"/>
-              <w:left w:val="single" w:color="D9DEE8" w:sz="4"/>
-              <w:bottom w:val="single" w:color="D9DEE8" w:sz="4"/>
-              <w:right w:val="single" w:color="D9DEE8" w:sz="4"/>
-            </w:tcBorders>
-            <w:shd w:fill="FFFFFF" w:val="clear"/>
-            <w:tcMar>
-              <w:top w:type="dxa" w:w="90"/>
-              <w:left w:type="dxa" w:w="140"/>
-              <w:bottom w:type="dxa" w:w="90"/>
-              <w:right w:type="dxa" w:w="120"/>
-            </w:tcMar>
-          </w:tcPr>
-          <w:p>
-            <w:pPr>
-              <w:spacing w:after="0"/>
-            </w:pPr>
-            <w:r>
-              <w:rPr>
-                <w:color w:val="1A2233"/>
-                <w:sz w:val="20"/>
-                <w:szCs w:val="20"/>
-              </w:rPr>
-              <w:t xml:space="preserve">Steuerbelege je Jahr (2024 / 2025 / …)</w:t>
-            </w:r>
-          </w:p>
-        </w:tc>
-      </w:tr>
-      <w:tr>
-        <w:tc>
-          <w:tcPr>
-            <w:tcW w:type="dxa" w:w="2400"/>
-            <w:tcBorders>
-              <w:top w:val="single" w:color="D9DEE8" w:sz="4"/>
-              <w:left w:val="single" w:color="D9DEE8" w:sz="4"/>
-              <w:bottom w:val="single" w:color="D9DEE8" w:sz="4"/>
-              <w:right w:val="single" w:color="D9DEE8" w:sz="4"/>
-            </w:tcBorders>
-            <w:shd w:fill="FFFFFF" w:val="clear"/>
-            <w:tcMar>
-              <w:top w:type="dxa" w:w="90"/>
-              <w:left w:type="dxa" w:w="140"/>
-              <w:bottom w:type="dxa" w:w="90"/>
-              <w:right w:type="dxa" w:w="120"/>
-            </w:tcMar>
-          </w:tcPr>
-          <w:p>
-            <w:pPr>
-              <w:spacing w:after="0"/>
-            </w:pPr>
-            <w:r>
-              <w:rPr>
-                <w:b/>
-                <w:bCs/>
-                <w:color w:val="1A2233"/>
-                <w:sz w:val="20"/>
-                <w:szCs w:val="20"/>
-              </w:rPr>
-              <w:t xml:space="preserve">07_Nebenkosten</w:t>
-            </w:r>
-          </w:p>
-        </w:tc>
-        <w:tc>
-          <w:tcPr>
-            <w:tcW w:type="dxa" w:w="6626"/>
-            <w:tcBorders>
-              <w:top w:val="single" w:color="D9DEE8" w:sz="4"/>
-              <w:left w:val="single" w:color="D9DEE8" w:sz="4"/>
-              <w:bottom w:val="single" w:color="D9DEE8" w:sz="4"/>
-              <w:right w:val="single" w:color="D9DEE8" w:sz="4"/>
-            </w:tcBorders>
-            <w:shd w:fill="FFFFFF" w:val="clear"/>
-            <w:tcMar>
-              <w:top w:type="dxa" w:w="90"/>
-              <w:left w:type="dxa" w:w="140"/>
-              <w:bottom w:type="dxa" w:w="90"/>
-              <w:right w:type="dxa" w:w="120"/>
-            </w:tcMar>
-          </w:tcPr>
-          <w:p>
-            <w:pPr>
-              <w:spacing w:after="0"/>
-            </w:pPr>
-            <w:r>
-              <w:rPr>
-                <w:color w:val="1A2233"/>
-                <w:sz w:val="20"/>
-                <w:szCs w:val="20"/>
-              </w:rPr>
-              <w:t xml:space="preserve">Nebenkostenabrechnungen je Jahr</w:t>
-            </w:r>
-          </w:p>
-        </w:tc>
-      </w:tr>
-      <w:tr>
-        <w:tc>
-          <w:tcPr>
-            <w:tcW w:type="dxa" w:w="2400"/>
-            <w:tcBorders>
-              <w:top w:val="single" w:color="D9DEE8" w:sz="4"/>
-              <w:left w:val="single" w:color="D9DEE8" w:sz="4"/>
-              <w:bottom w:val="single" w:color="D9DEE8" w:sz="4"/>
-              <w:right w:val="single" w:color="D9DEE8" w:sz="4"/>
-            </w:tcBorders>
-            <w:shd w:fill="FFFFFF" w:val="clear"/>
-            <w:tcMar>
-              <w:top w:type="dxa" w:w="90"/>
-              <w:left w:type="dxa" w:w="140"/>
-              <w:bottom w:type="dxa" w:w="90"/>
-              <w:right w:type="dxa" w:w="120"/>
-            </w:tcMar>
-          </w:tcPr>
-          <w:p>
-            <w:pPr>
-              <w:spacing w:after="0"/>
-            </w:pPr>
-            <w:r>
-              <w:rPr>
-                <w:b/>
-                <w:bCs/>
-                <w:color w:val="1A2233"/>
-                <w:sz w:val="20"/>
-                <w:szCs w:val="20"/>
-              </w:rPr>
-              <w:t xml:space="preserve">08_Steuer</w:t>
-            </w:r>
-          </w:p>
-        </w:tc>
-        <w:tc>
-          <w:tcPr>
-            <w:tcW w:type="dxa" w:w="6626"/>
-            <w:tcBorders>
-              <w:top w:val="single" w:color="D9DEE8" w:sz="4"/>
-              <w:left w:val="single" w:color="D9DEE8" w:sz="4"/>
-              <w:bottom w:val="single" w:color="D9DEE8" w:sz="4"/>
-              <w:right w:val="single" w:color="D9DEE8" w:sz="4"/>
-            </w:tcBorders>
-            <w:shd w:fill="FFFFFF" w:val="clear"/>
-            <w:tcMar>
-              <w:top w:type="dxa" w:w="90"/>
-              <w:left w:type="dxa" w:w="140"/>
-              <w:bottom w:type="dxa" w:w="90"/>
-              <w:right w:type="dxa" w:w="120"/>
-            </w:tcMar>
-          </w:tcPr>
-          <w:p>
-            <w:pPr>
-              <w:spacing w:after="0"/>
-            </w:pPr>
-            <w:r>
-              <w:rPr>
-                <w:color w:val="1A2233"/>
-                <w:sz w:val="20"/>
-                <w:szCs w:val="20"/>
-              </w:rPr>
-              <w:t xml:space="preserve">Anlage V / Feststellung je Jahr</w:t>
-            </w:r>
-          </w:p>
-        </w:tc>
-      </w:tr>
-      <w:tr>
-        <w:tc>
-          <w:tcPr>
-            <w:tcW w:type="dxa" w:w="2400"/>
-            <w:tcBorders>
-              <w:top w:val="single" w:color="D9DEE8" w:sz="4"/>
-              <w:left w:val="single" w:color="D9DEE8" w:sz="4"/>
-              <w:bottom w:val="single" w:color="D9DEE8" w:sz="4"/>
-              <w:right w:val="single" w:color="D9DEE8" w:sz="4"/>
-            </w:tcBorders>
-            <w:shd w:fill="FFFFFF" w:val="clear"/>
-            <w:tcMar>
-              <w:top w:type="dxa" w:w="90"/>
-              <w:left w:type="dxa" w:w="140"/>
-              <w:bottom w:type="dxa" w:w="90"/>
-              <w:right w:type="dxa" w:w="120"/>
-            </w:tcMar>
-          </w:tcPr>
-          <w:p>
-            <w:pPr>
-              <w:spacing w:after="0"/>
-            </w:pPr>
-            <w:r>
-              <w:rPr>
-                <w:b/>
-                <w:bCs/>
-                <w:color w:val="1A2233"/>
-                <w:sz w:val="20"/>
-                <w:szCs w:val="20"/>
-              </w:rPr>
-              <w:t xml:space="preserve">09_Konto</w:t>
-            </w:r>
-          </w:p>
-        </w:tc>
-        <w:tc>
-          <w:tcPr>
-            <w:tcW w:type="dxa" w:w="6626"/>
-            <w:tcBorders>
-              <w:top w:val="single" w:color="D9DEE8" w:sz="4"/>
-              <w:left w:val="single" w:color="D9DEE8" w:sz="4"/>
-              <w:bottom w:val="single" w:color="D9DEE8" w:sz="4"/>
-              <w:right w:val="single" w:color="D9DEE8" w:sz="4"/>
-            </w:tcBorders>
-            <w:shd w:fill="FFFFFF" w:val="clear"/>
-            <w:tcMar>
-              <w:top w:type="dxa" w:w="90"/>
-              <w:left w:type="dxa" w:w="140"/>
-              <w:bottom w:type="dxa" w:w="90"/>
-              <w:right w:type="dxa" w:w="120"/>
-            </w:tcMar>
-          </w:tcPr>
-          <w:p>
-            <w:pPr>
-              <w:spacing w:after="0"/>
-            </w:pPr>
-            <w:r>
-              <w:rPr>
-                <w:color w:val="1A2233"/>
-                <w:sz w:val="20"/>
-                <w:szCs w:val="20"/>
-              </w:rPr>
-              <w:t xml:space="preserve">Objektkonto – Auszüge, Kontoinfos</w:t>
-            </w:r>
-          </w:p>
-        </w:tc>
-      </w:tr>
-    </w:tbl>
-    <w:p>
-      <w:pPr>
-        <w:pBdr>
-          <w:top w:val="single" w:color="F0DCB4" w:sz="2"/>
-          <w:bottom w:val="single" w:color="F0DCB4" w:sz="2"/>
-          <w:left w:val="single" w:color="9A7B22" w:sz="18" w:space="10"/>
-          <w:right w:val="single" w:color="F0DCB4" w:sz="2"/>
-        </w:pBdr>
-        <w:shd w:fill="FFF8EC" w:val="clear"/>
-        <w:spacing w:after="0" w:before="140"/>
-      </w:pPr>
-      <w:r>
-        <w:rPr>
-          <w:b/>
-          <w:bCs/>
-          <w:color w:val="5C4615"/>
-          <w:sz w:val="21"/>
-          <w:szCs w:val="21"/>
-        </w:rPr>
-        <w:t xml:space="preserve">Steuer-Kernregel:  </w:t>
-      </w:r>
-      <w:r>
-        <w:rPr>
-          <w:color w:val="5C4615"/>
-          <w:sz w:val="21"/>
-          <w:szCs w:val="21"/>
-        </w:rPr>
-        <w:t xml:space="preserve">Reparaturen und Modernisierung strikt getrennt ablegen – wegen der 15-%-Grenze für anschaffungsnahe Herstellungskosten (§ 6 Abs. 1 Nr. 1a EStG) in den ersten drei Jahren nach Kauf.</w:t>
-      </w:r>
-    </w:p>
-    <w:p>
-      <w:pPr>
-        <w:pStyle w:val="Heading1"/>
-      </w:pPr>
-      <w:r>
-        <w:t xml:space="preserve">Die Einheiten-Ebene – Wohnungen &amp; Mieter</w:t>
-      </w:r>
-    </w:p>
-    <w:p>
-      <w:pPr>
-        <w:spacing w:after="120"/>
-      </w:pPr>
-      <w:r>
-        <w:rPr>
-          <w:sz w:val="22"/>
-          <w:szCs w:val="22"/>
-        </w:rPr>
-        <w:t xml:space="preserve">Jede Wohnung ist ein stabiler Ordner. Darin liegt die Mieter-Chronik: pro Mieter ein datierter Ordner – so siehst du auf einen Blick, wer wann in der Wohnung wohnte, und behältst jede Mietakte.</w:t>
+        <w:t xml:space="preserve">Und jedes einzelne Objekt sieht innen immer gleich aus – die Ordner 00–09:</w:t>
       </w:r>
     </w:p>
     <w:p>
@@ -1320,7 +516,7 @@
       <w:r>
         <w:drawing>
           <wp:inline distT="0" distB="0" distL="0" distR="0">
-            <wp:extent cx="5143500" cy="2971800"/>
+            <wp:extent cx="5143500" cy="3524250"/>
             <wp:effectExtent t="0" r="0" b="0" l="0"/>
             <wp:docPr id="1" name="finder" descr="macOS Finder Beispielansicht der Ordnerstruktur" title="Finder-Beispiel"/>
             <wp:cNvGraphicFramePr>
@@ -1345,7 +541,7 @@
                   <pic:spPr bwMode="auto">
                     <a:xfrm>
                       <a:off x="0" y="0"/>
-                      <a:ext cx="5143500" cy="2971800"/>
+                      <a:ext cx="5143500" cy="3524250"/>
                     </a:xfrm>
                     <a:prstGeom prst="rect">
                       <a:avLst/>
@@ -1371,130 +567,853 @@
           <w:sz w:val="16"/>
           <w:szCs w:val="16"/>
         </w:rPr>
-        <w:t xml:space="preserve">Pro Wohnung eine chronologische Mieter-Liste – nichts wird gelöscht</w:t>
-      </w:r>
-    </w:p>
-    <w:p>
-      <w:pPr>
-        <w:spacing w:after="80"/>
+        <w:t xml:space="preserve">Ein Objekt im Bestand – Buy &amp; Hold</w:t>
+      </w:r>
+    </w:p>
+    <w:p>
+      <w:pPr>
+        <w:pBdr>
+          <w:top w:val="single" w:color="C9DBFF" w:sz="2"/>
+          <w:bottom w:val="single" w:color="C9DBFF" w:sz="2"/>
+          <w:left w:val="single" w:color="2F6BFF" w:sz="18" w:space="10"/>
+          <w:right w:val="single" w:color="C9DBFF" w:sz="2"/>
+        </w:pBdr>
+        <w:shd w:fill="E8F0FE" w:val="clear"/>
+        <w:spacing w:after="60" w:before="40"/>
+      </w:pPr>
+      <w:r>
+        <w:rPr>
+          <w:b/>
+          <w:bCs/>
+          <w:color w:val="123A86"/>
+          <w:sz w:val="21"/>
+          <w:szCs w:val="21"/>
+        </w:rPr>
+        <w:t xml:space="preserve">Nur ein, zwei Eigentumswohnungen?  </w:t>
+      </w:r>
+      <w:r>
+        <w:rPr>
+          <w:color w:val="123A86"/>
+          <w:sz w:val="21"/>
+          <w:szCs w:val="21"/>
+        </w:rPr>
+        <w:t xml:space="preserve">Dann brauchst du die Firmen-Ebene gar nicht – deine Wohnung ist einfach ein Objekt mit den Ordnern 00–09. Genauso einfach.</w:t>
+      </w:r>
+    </w:p>
+    <w:p>
+      <w:pPr>
+        <w:pStyle w:val="Heading1"/>
+        <w:pageBreakBefore/>
+      </w:pPr>
+      <w:r>
+        <w:t xml:space="preserve">Die Objekt-Vorlage (00–09)</w:t>
+      </w:r>
+    </w:p>
+    <w:p>
+      <w:pPr>
+        <w:spacing w:after="120"/>
       </w:pPr>
       <w:r>
         <w:rPr>
           <w:sz w:val="22"/>
           <w:szCs w:val="22"/>
         </w:rPr>
-        <w:t xml:space="preserve">Pro Mieter-Ordner: Mietvertrag, Selbstauskunft/Bonität, Kaution, Übergabe (Ein+Aus), Mieterhöhungen, Korrespondenz.</w:t>
-      </w:r>
-    </w:p>
-    <w:p>
-      <w:pPr>
-        <w:pStyle w:val="ListParagraph"/>
-        <w:numPr>
-          <w:ilvl w:val="0"/>
-          <w:numId w:val="2"/>
-        </w:numPr>
-        <w:spacing w:after="60"/>
+        <w:t xml:space="preserve">Eine einzige Vorlage für jedes Objekt. Gleiche Struktur überall – man findet sich auf jedem Objekt sofort zurecht.</w:t>
+      </w:r>
+    </w:p>
+    <w:tbl>
+      <w:tblPr>
+        <w:tblW w:type="dxa" w:w="9026"/>
+        <w:tblBorders>
+          <w:top w:val="single" w:color="auto" w:sz="4"/>
+          <w:left w:val="single" w:color="auto" w:sz="4"/>
+          <w:bottom w:val="single" w:color="auto" w:sz="4"/>
+          <w:right w:val="single" w:color="auto" w:sz="4"/>
+          <w:insideH w:val="single" w:color="auto" w:sz="4"/>
+          <w:insideV w:val="single" w:color="auto" w:sz="4"/>
+        </w:tblBorders>
+      </w:tblPr>
+      <w:tblGrid>
+        <w:gridCol w:w="2400"/>
+        <w:gridCol w:w="6626"/>
+      </w:tblGrid>
+      <w:tr>
+        <w:tc>
+          <w:tcPr>
+            <w:tcW w:type="dxa" w:w="2400"/>
+            <w:tcBorders>
+              <w:top w:val="single" w:color="D9DEE8" w:sz="4"/>
+              <w:left w:val="single" w:color="D9DEE8" w:sz="4"/>
+              <w:bottom w:val="single" w:color="D9DEE8" w:sz="4"/>
+              <w:right w:val="single" w:color="D9DEE8" w:sz="4"/>
+            </w:tcBorders>
+            <w:shd w:fill="1F4E79" w:val="clear"/>
+            <w:tcMar>
+              <w:top w:type="dxa" w:w="90"/>
+              <w:left w:type="dxa" w:w="140"/>
+              <w:bottom w:type="dxa" w:w="90"/>
+              <w:right w:type="dxa" w:w="120"/>
+            </w:tcMar>
+          </w:tcPr>
+          <w:p>
+            <w:pPr>
+              <w:spacing w:after="0"/>
+            </w:pPr>
+            <w:r>
+              <w:rPr>
+                <w:b/>
+                <w:bCs/>
+                <w:color w:val="FFFFFF"/>
+                <w:sz w:val="20"/>
+                <w:szCs w:val="20"/>
+              </w:rPr>
+              <w:t xml:space="preserve">Ordner</w:t>
+            </w:r>
+          </w:p>
+        </w:tc>
+        <w:tc>
+          <w:tcPr>
+            <w:tcW w:type="dxa" w:w="6626"/>
+            <w:tcBorders>
+              <w:top w:val="single" w:color="D9DEE8" w:sz="4"/>
+              <w:left w:val="single" w:color="D9DEE8" w:sz="4"/>
+              <w:bottom w:val="single" w:color="D9DEE8" w:sz="4"/>
+              <w:right w:val="single" w:color="D9DEE8" w:sz="4"/>
+            </w:tcBorders>
+            <w:shd w:fill="1F4E79" w:val="clear"/>
+            <w:tcMar>
+              <w:top w:type="dxa" w:w="90"/>
+              <w:left w:type="dxa" w:w="140"/>
+              <w:bottom w:type="dxa" w:w="90"/>
+              <w:right w:type="dxa" w:w="120"/>
+            </w:tcMar>
+          </w:tcPr>
+          <w:p>
+            <w:pPr>
+              <w:spacing w:after="0"/>
+            </w:pPr>
+            <w:r>
+              <w:rPr>
+                <w:b/>
+                <w:bCs/>
+                <w:color w:val="FFFFFF"/>
+                <w:sz w:val="20"/>
+                <w:szCs w:val="20"/>
+              </w:rPr>
+              <w:t xml:space="preserve">Inhalt</w:t>
+            </w:r>
+          </w:p>
+        </w:tc>
+      </w:tr>
+      <w:tr>
+        <w:tc>
+          <w:tcPr>
+            <w:tcW w:type="dxa" w:w="2400"/>
+            <w:tcBorders>
+              <w:top w:val="single" w:color="D9DEE8" w:sz="4"/>
+              <w:left w:val="single" w:color="D9DEE8" w:sz="4"/>
+              <w:bottom w:val="single" w:color="D9DEE8" w:sz="4"/>
+              <w:right w:val="single" w:color="D9DEE8" w:sz="4"/>
+            </w:tcBorders>
+            <w:shd w:fill="FFFFFF" w:val="clear"/>
+            <w:tcMar>
+              <w:top w:type="dxa" w:w="90"/>
+              <w:left w:type="dxa" w:w="140"/>
+              <w:bottom w:type="dxa" w:w="90"/>
+              <w:right w:type="dxa" w:w="120"/>
+            </w:tcMar>
+          </w:tcPr>
+          <w:p>
+            <w:pPr>
+              <w:spacing w:after="0"/>
+            </w:pPr>
+            <w:r>
+              <w:rPr>
+                <w:b/>
+                <w:bCs/>
+                <w:color w:val="1A2233"/>
+                <w:sz w:val="20"/>
+                <w:szCs w:val="20"/>
+              </w:rPr>
+              <w:t xml:space="preserve">00_Objektdatenblatt</w:t>
+            </w:r>
+          </w:p>
+        </w:tc>
+        <w:tc>
+          <w:tcPr>
+            <w:tcW w:type="dxa" w:w="6626"/>
+            <w:tcBorders>
+              <w:top w:val="single" w:color="D9DEE8" w:sz="4"/>
+              <w:left w:val="single" w:color="D9DEE8" w:sz="4"/>
+              <w:bottom w:val="single" w:color="D9DEE8" w:sz="4"/>
+              <w:right w:val="single" w:color="D9DEE8" w:sz="4"/>
+            </w:tcBorders>
+            <w:shd w:fill="FFFFFF" w:val="clear"/>
+            <w:tcMar>
+              <w:top w:type="dxa" w:w="90"/>
+              <w:left w:type="dxa" w:w="140"/>
+              <w:bottom w:type="dxa" w:w="90"/>
+              <w:right w:type="dxa" w:w="120"/>
+            </w:tcMar>
+          </w:tcPr>
+          <w:p>
+            <w:pPr>
+              <w:spacing w:after="0"/>
+            </w:pPr>
+            <w:r>
+              <w:rPr>
+                <w:color w:val="1A2233"/>
+                <w:sz w:val="20"/>
+                <w:szCs w:val="20"/>
+              </w:rPr>
+              <w:t xml:space="preserve">Eckdaten, Kürzel, Fläche, Baujahr, Kaufdatum, AfA-Basis, Zählernummern</w:t>
+            </w:r>
+          </w:p>
+        </w:tc>
+      </w:tr>
+      <w:tr>
+        <w:tc>
+          <w:tcPr>
+            <w:tcW w:type="dxa" w:w="2400"/>
+            <w:tcBorders>
+              <w:top w:val="single" w:color="D9DEE8" w:sz="4"/>
+              <w:left w:val="single" w:color="D9DEE8" w:sz="4"/>
+              <w:bottom w:val="single" w:color="D9DEE8" w:sz="4"/>
+              <w:right w:val="single" w:color="D9DEE8" w:sz="4"/>
+            </w:tcBorders>
+            <w:shd w:fill="FFFFFF" w:val="clear"/>
+            <w:tcMar>
+              <w:top w:type="dxa" w:w="90"/>
+              <w:left w:type="dxa" w:w="140"/>
+              <w:bottom w:type="dxa" w:w="90"/>
+              <w:right w:type="dxa" w:w="120"/>
+            </w:tcMar>
+          </w:tcPr>
+          <w:p>
+            <w:pPr>
+              <w:spacing w:after="0"/>
+            </w:pPr>
+            <w:r>
+              <w:rPr>
+                <w:b/>
+                <w:bCs/>
+                <w:color w:val="1A2233"/>
+                <w:sz w:val="20"/>
+                <w:szCs w:val="20"/>
+              </w:rPr>
+              <w:t xml:space="preserve">01_Stammdaten</w:t>
+            </w:r>
+          </w:p>
+        </w:tc>
+        <w:tc>
+          <w:tcPr>
+            <w:tcW w:type="dxa" w:w="6626"/>
+            <w:tcBorders>
+              <w:top w:val="single" w:color="D9DEE8" w:sz="4"/>
+              <w:left w:val="single" w:color="D9DEE8" w:sz="4"/>
+              <w:bottom w:val="single" w:color="D9DEE8" w:sz="4"/>
+              <w:right w:val="single" w:color="D9DEE8" w:sz="4"/>
+            </w:tcBorders>
+            <w:shd w:fill="FFFFFF" w:val="clear"/>
+            <w:tcMar>
+              <w:top w:type="dxa" w:w="90"/>
+              <w:left w:type="dxa" w:w="140"/>
+              <w:bottom w:type="dxa" w:w="90"/>
+              <w:right w:type="dxa" w:w="120"/>
+            </w:tcMar>
+          </w:tcPr>
+          <w:p>
+            <w:pPr>
+              <w:spacing w:after="0"/>
+            </w:pPr>
+            <w:r>
+              <w:rPr>
+                <w:color w:val="1A2233"/>
+                <w:sz w:val="20"/>
+                <w:szCs w:val="20"/>
+              </w:rPr>
+              <w:t xml:space="preserve">Grundbuch, Pläne, Lageplan, Wohnflächenberechnung, Energieausweis, Teilungserklärung</w:t>
+            </w:r>
+          </w:p>
+        </w:tc>
+      </w:tr>
+      <w:tr>
+        <w:tc>
+          <w:tcPr>
+            <w:tcW w:type="dxa" w:w="2400"/>
+            <w:tcBorders>
+              <w:top w:val="single" w:color="D9DEE8" w:sz="4"/>
+              <w:left w:val="single" w:color="D9DEE8" w:sz="4"/>
+              <w:bottom w:val="single" w:color="D9DEE8" w:sz="4"/>
+              <w:right w:val="single" w:color="D9DEE8" w:sz="4"/>
+            </w:tcBorders>
+            <w:shd w:fill="FFFFFF" w:val="clear"/>
+            <w:tcMar>
+              <w:top w:type="dxa" w:w="90"/>
+              <w:left w:type="dxa" w:w="140"/>
+              <w:bottom w:type="dxa" w:w="90"/>
+              <w:right w:type="dxa" w:w="120"/>
+            </w:tcMar>
+          </w:tcPr>
+          <w:p>
+            <w:pPr>
+              <w:spacing w:after="0"/>
+            </w:pPr>
+            <w:r>
+              <w:rPr>
+                <w:b/>
+                <w:bCs/>
+                <w:color w:val="1A2233"/>
+                <w:sz w:val="20"/>
+                <w:szCs w:val="20"/>
+              </w:rPr>
+              <w:t xml:space="preserve">02_Kaufprozess</w:t>
+            </w:r>
+          </w:p>
+        </w:tc>
+        <w:tc>
+          <w:tcPr>
+            <w:tcW w:type="dxa" w:w="6626"/>
+            <w:tcBorders>
+              <w:top w:val="single" w:color="D9DEE8" w:sz="4"/>
+              <w:left w:val="single" w:color="D9DEE8" w:sz="4"/>
+              <w:bottom w:val="single" w:color="D9DEE8" w:sz="4"/>
+              <w:right w:val="single" w:color="D9DEE8" w:sz="4"/>
+            </w:tcBorders>
+            <w:shd w:fill="FFFFFF" w:val="clear"/>
+            <w:tcMar>
+              <w:top w:type="dxa" w:w="90"/>
+              <w:left w:type="dxa" w:w="140"/>
+              <w:bottom w:type="dxa" w:w="90"/>
+              <w:right w:type="dxa" w:w="120"/>
+            </w:tcMar>
+          </w:tcPr>
+          <w:p>
+            <w:pPr>
+              <w:spacing w:after="0"/>
+            </w:pPr>
+            <w:r>
+              <w:rPr>
+                <w:color w:val="1A2233"/>
+                <w:sz w:val="20"/>
+                <w:szCs w:val="20"/>
+              </w:rPr>
+              <w:t xml:space="preserve">Exposé, Notar/Kaufvertrag, Kaufpreisaufteilung, Kaufnebenkosten</w:t>
+            </w:r>
+          </w:p>
+        </w:tc>
+      </w:tr>
+      <w:tr>
+        <w:tc>
+          <w:tcPr>
+            <w:tcW w:type="dxa" w:w="2400"/>
+            <w:tcBorders>
+              <w:top w:val="single" w:color="D9DEE8" w:sz="4"/>
+              <w:left w:val="single" w:color="D9DEE8" w:sz="4"/>
+              <w:bottom w:val="single" w:color="D9DEE8" w:sz="4"/>
+              <w:right w:val="single" w:color="D9DEE8" w:sz="4"/>
+            </w:tcBorders>
+            <w:shd w:fill="FFFFFF" w:val="clear"/>
+            <w:tcMar>
+              <w:top w:type="dxa" w:w="90"/>
+              <w:left w:type="dxa" w:w="140"/>
+              <w:bottom w:type="dxa" w:w="90"/>
+              <w:right w:type="dxa" w:w="120"/>
+            </w:tcMar>
+          </w:tcPr>
+          <w:p>
+            <w:pPr>
+              <w:spacing w:after="0"/>
+            </w:pPr>
+            <w:r>
+              <w:rPr>
+                <w:b/>
+                <w:bCs/>
+                <w:color w:val="1A2233"/>
+                <w:sz w:val="20"/>
+                <w:szCs w:val="20"/>
+              </w:rPr>
+              <w:t xml:space="preserve">03_Finanzierung</w:t>
+            </w:r>
+          </w:p>
+        </w:tc>
+        <w:tc>
+          <w:tcPr>
+            <w:tcW w:type="dxa" w:w="6626"/>
+            <w:tcBorders>
+              <w:top w:val="single" w:color="D9DEE8" w:sz="4"/>
+              <w:left w:val="single" w:color="D9DEE8" w:sz="4"/>
+              <w:bottom w:val="single" w:color="D9DEE8" w:sz="4"/>
+              <w:right w:val="single" w:color="D9DEE8" w:sz="4"/>
+            </w:tcBorders>
+            <w:shd w:fill="FFFFFF" w:val="clear"/>
+            <w:tcMar>
+              <w:top w:type="dxa" w:w="90"/>
+              <w:left w:type="dxa" w:w="140"/>
+              <w:bottom w:type="dxa" w:w="90"/>
+              <w:right w:type="dxa" w:w="120"/>
+            </w:tcMar>
+          </w:tcPr>
+          <w:p>
+            <w:pPr>
+              <w:spacing w:after="0"/>
+            </w:pPr>
+            <w:r>
+              <w:rPr>
+                <w:color w:val="1A2233"/>
+                <w:sz w:val="20"/>
+                <w:szCs w:val="20"/>
+              </w:rPr>
+              <w:t xml:space="preserve">Darlehensverträge, Grundschuld, Tilgungspläne, Zinsbescheinigungen</w:t>
+            </w:r>
+          </w:p>
+        </w:tc>
+      </w:tr>
+      <w:tr>
+        <w:tc>
+          <w:tcPr>
+            <w:tcW w:type="dxa" w:w="2400"/>
+            <w:tcBorders>
+              <w:top w:val="single" w:color="D9DEE8" w:sz="4"/>
+              <w:left w:val="single" w:color="D9DEE8" w:sz="4"/>
+              <w:bottom w:val="single" w:color="D9DEE8" w:sz="4"/>
+              <w:right w:val="single" w:color="D9DEE8" w:sz="4"/>
+            </w:tcBorders>
+            <w:shd w:fill="FFFFFF" w:val="clear"/>
+            <w:tcMar>
+              <w:top w:type="dxa" w:w="90"/>
+              <w:left w:type="dxa" w:w="140"/>
+              <w:bottom w:type="dxa" w:w="90"/>
+              <w:right w:type="dxa" w:w="120"/>
+            </w:tcMar>
+          </w:tcPr>
+          <w:p>
+            <w:pPr>
+              <w:spacing w:after="0"/>
+            </w:pPr>
+            <w:r>
+              <w:rPr>
+                <w:b/>
+                <w:bCs/>
+                <w:color w:val="1A2233"/>
+                <w:sz w:val="20"/>
+                <w:szCs w:val="20"/>
+              </w:rPr>
+              <w:t xml:space="preserve">04_Einheiten</w:t>
+            </w:r>
+          </w:p>
+        </w:tc>
+        <w:tc>
+          <w:tcPr>
+            <w:tcW w:type="dxa" w:w="6626"/>
+            <w:tcBorders>
+              <w:top w:val="single" w:color="D9DEE8" w:sz="4"/>
+              <w:left w:val="single" w:color="D9DEE8" w:sz="4"/>
+              <w:bottom w:val="single" w:color="D9DEE8" w:sz="4"/>
+              <w:right w:val="single" w:color="D9DEE8" w:sz="4"/>
+            </w:tcBorders>
+            <w:shd w:fill="FFFFFF" w:val="clear"/>
+            <w:tcMar>
+              <w:top w:type="dxa" w:w="90"/>
+              <w:left w:type="dxa" w:w="140"/>
+              <w:bottom w:type="dxa" w:w="90"/>
+              <w:right w:type="dxa" w:w="120"/>
+            </w:tcMar>
+          </w:tcPr>
+          <w:p>
+            <w:pPr>
+              <w:spacing w:after="0"/>
+            </w:pPr>
+            <w:r>
+              <w:rPr>
+                <w:color w:val="1A2233"/>
+                <w:sz w:val="20"/>
+                <w:szCs w:val="20"/>
+              </w:rPr>
+              <w:t xml:space="preserve">Je Wohnung ein Ordner mit Mieter-Chronik (s.u.): pro Mieter eine datierte Mietakte</w:t>
+            </w:r>
+          </w:p>
+        </w:tc>
+      </w:tr>
+      <w:tr>
+        <w:tc>
+          <w:tcPr>
+            <w:tcW w:type="dxa" w:w="2400"/>
+            <w:tcBorders>
+              <w:top w:val="single" w:color="D9DEE8" w:sz="4"/>
+              <w:left w:val="single" w:color="D9DEE8" w:sz="4"/>
+              <w:bottom w:val="single" w:color="D9DEE8" w:sz="4"/>
+              <w:right w:val="single" w:color="D9DEE8" w:sz="4"/>
+            </w:tcBorders>
+            <w:shd w:fill="FFFFFF" w:val="clear"/>
+            <w:tcMar>
+              <w:top w:type="dxa" w:w="90"/>
+              <w:left w:type="dxa" w:w="140"/>
+              <w:bottom w:type="dxa" w:w="90"/>
+              <w:right w:type="dxa" w:w="120"/>
+            </w:tcMar>
+          </w:tcPr>
+          <w:p>
+            <w:pPr>
+              <w:spacing w:after="0"/>
+            </w:pPr>
+            <w:r>
+              <w:rPr>
+                <w:b/>
+                <w:bCs/>
+                <w:color w:val="1A2233"/>
+                <w:sz w:val="20"/>
+                <w:szCs w:val="20"/>
+              </w:rPr>
+              <w:t xml:space="preserve">05_Verwaltung</w:t>
+            </w:r>
+          </w:p>
+        </w:tc>
+        <w:tc>
+          <w:tcPr>
+            <w:tcW w:type="dxa" w:w="6626"/>
+            <w:tcBorders>
+              <w:top w:val="single" w:color="D9DEE8" w:sz="4"/>
+              <w:left w:val="single" w:color="D9DEE8" w:sz="4"/>
+              <w:bottom w:val="single" w:color="D9DEE8" w:sz="4"/>
+              <w:right w:val="single" w:color="D9DEE8" w:sz="4"/>
+            </w:tcBorders>
+            <w:shd w:fill="FFFFFF" w:val="clear"/>
+            <w:tcMar>
+              <w:top w:type="dxa" w:w="90"/>
+              <w:left w:type="dxa" w:w="140"/>
+              <w:bottom w:type="dxa" w:w="90"/>
+              <w:right w:type="dxa" w:w="120"/>
+            </w:tcMar>
+          </w:tcPr>
+          <w:p>
+            <w:pPr>
+              <w:spacing w:after="0"/>
+            </w:pPr>
+            <w:r>
+              <w:rPr>
+                <w:color w:val="1A2233"/>
+                <w:sz w:val="20"/>
+                <w:szCs w:val="20"/>
+              </w:rPr>
+              <w:t xml:space="preserve">Versicherung, Grundsteuer, Reparaturen, Modernisierung, Zählerstände, Fotos, WEG</w:t>
+            </w:r>
+          </w:p>
+        </w:tc>
+      </w:tr>
+      <w:tr>
+        <w:tc>
+          <w:tcPr>
+            <w:tcW w:type="dxa" w:w="2400"/>
+            <w:tcBorders>
+              <w:top w:val="single" w:color="D9DEE8" w:sz="4"/>
+              <w:left w:val="single" w:color="D9DEE8" w:sz="4"/>
+              <w:bottom w:val="single" w:color="D9DEE8" w:sz="4"/>
+              <w:right w:val="single" w:color="D9DEE8" w:sz="4"/>
+            </w:tcBorders>
+            <w:shd w:fill="FFFFFF" w:val="clear"/>
+            <w:tcMar>
+              <w:top w:type="dxa" w:w="90"/>
+              <w:left w:type="dxa" w:w="140"/>
+              <w:bottom w:type="dxa" w:w="90"/>
+              <w:right w:type="dxa" w:w="120"/>
+            </w:tcMar>
+          </w:tcPr>
+          <w:p>
+            <w:pPr>
+              <w:spacing w:after="0"/>
+            </w:pPr>
+            <w:r>
+              <w:rPr>
+                <w:b/>
+                <w:bCs/>
+                <w:color w:val="1A2233"/>
+                <w:sz w:val="20"/>
+                <w:szCs w:val="20"/>
+              </w:rPr>
+              <w:t xml:space="preserve">06_Belege</w:t>
+            </w:r>
+          </w:p>
+        </w:tc>
+        <w:tc>
+          <w:tcPr>
+            <w:tcW w:type="dxa" w:w="6626"/>
+            <w:tcBorders>
+              <w:top w:val="single" w:color="D9DEE8" w:sz="4"/>
+              <w:left w:val="single" w:color="D9DEE8" w:sz="4"/>
+              <w:bottom w:val="single" w:color="D9DEE8" w:sz="4"/>
+              <w:right w:val="single" w:color="D9DEE8" w:sz="4"/>
+            </w:tcBorders>
+            <w:shd w:fill="FFFFFF" w:val="clear"/>
+            <w:tcMar>
+              <w:top w:type="dxa" w:w="90"/>
+              <w:left w:type="dxa" w:w="140"/>
+              <w:bottom w:type="dxa" w:w="90"/>
+              <w:right w:type="dxa" w:w="120"/>
+            </w:tcMar>
+          </w:tcPr>
+          <w:p>
+            <w:pPr>
+              <w:spacing w:after="0"/>
+            </w:pPr>
+            <w:r>
+              <w:rPr>
+                <w:color w:val="1A2233"/>
+                <w:sz w:val="20"/>
+                <w:szCs w:val="20"/>
+              </w:rPr>
+              <w:t xml:space="preserve">Steuerbelege je Jahr (2024 / 2025 / …)</w:t>
+            </w:r>
+          </w:p>
+        </w:tc>
+      </w:tr>
+      <w:tr>
+        <w:tc>
+          <w:tcPr>
+            <w:tcW w:type="dxa" w:w="2400"/>
+            <w:tcBorders>
+              <w:top w:val="single" w:color="D9DEE8" w:sz="4"/>
+              <w:left w:val="single" w:color="D9DEE8" w:sz="4"/>
+              <w:bottom w:val="single" w:color="D9DEE8" w:sz="4"/>
+              <w:right w:val="single" w:color="D9DEE8" w:sz="4"/>
+            </w:tcBorders>
+            <w:shd w:fill="FFFFFF" w:val="clear"/>
+            <w:tcMar>
+              <w:top w:type="dxa" w:w="90"/>
+              <w:left w:type="dxa" w:w="140"/>
+              <w:bottom w:type="dxa" w:w="90"/>
+              <w:right w:type="dxa" w:w="120"/>
+            </w:tcMar>
+          </w:tcPr>
+          <w:p>
+            <w:pPr>
+              <w:spacing w:after="0"/>
+            </w:pPr>
+            <w:r>
+              <w:rPr>
+                <w:b/>
+                <w:bCs/>
+                <w:color w:val="1A2233"/>
+                <w:sz w:val="20"/>
+                <w:szCs w:val="20"/>
+              </w:rPr>
+              <w:t xml:space="preserve">07_Nebenkosten</w:t>
+            </w:r>
+          </w:p>
+        </w:tc>
+        <w:tc>
+          <w:tcPr>
+            <w:tcW w:type="dxa" w:w="6626"/>
+            <w:tcBorders>
+              <w:top w:val="single" w:color="D9DEE8" w:sz="4"/>
+              <w:left w:val="single" w:color="D9DEE8" w:sz="4"/>
+              <w:bottom w:val="single" w:color="D9DEE8" w:sz="4"/>
+              <w:right w:val="single" w:color="D9DEE8" w:sz="4"/>
+            </w:tcBorders>
+            <w:shd w:fill="FFFFFF" w:val="clear"/>
+            <w:tcMar>
+              <w:top w:type="dxa" w:w="90"/>
+              <w:left w:type="dxa" w:w="140"/>
+              <w:bottom w:type="dxa" w:w="90"/>
+              <w:right w:type="dxa" w:w="120"/>
+            </w:tcMar>
+          </w:tcPr>
+          <w:p>
+            <w:pPr>
+              <w:spacing w:after="0"/>
+            </w:pPr>
+            <w:r>
+              <w:rPr>
+                <w:color w:val="1A2233"/>
+                <w:sz w:val="20"/>
+                <w:szCs w:val="20"/>
+              </w:rPr>
+              <w:t xml:space="preserve">Nebenkostenabrechnungen je Jahr</w:t>
+            </w:r>
+          </w:p>
+        </w:tc>
+      </w:tr>
+      <w:tr>
+        <w:tc>
+          <w:tcPr>
+            <w:tcW w:type="dxa" w:w="2400"/>
+            <w:tcBorders>
+              <w:top w:val="single" w:color="D9DEE8" w:sz="4"/>
+              <w:left w:val="single" w:color="D9DEE8" w:sz="4"/>
+              <w:bottom w:val="single" w:color="D9DEE8" w:sz="4"/>
+              <w:right w:val="single" w:color="D9DEE8" w:sz="4"/>
+            </w:tcBorders>
+            <w:shd w:fill="FFFFFF" w:val="clear"/>
+            <w:tcMar>
+              <w:top w:type="dxa" w:w="90"/>
+              <w:left w:type="dxa" w:w="140"/>
+              <w:bottom w:type="dxa" w:w="90"/>
+              <w:right w:type="dxa" w:w="120"/>
+            </w:tcMar>
+          </w:tcPr>
+          <w:p>
+            <w:pPr>
+              <w:spacing w:after="0"/>
+            </w:pPr>
+            <w:r>
+              <w:rPr>
+                <w:b/>
+                <w:bCs/>
+                <w:color w:val="1A2233"/>
+                <w:sz w:val="20"/>
+                <w:szCs w:val="20"/>
+              </w:rPr>
+              <w:t xml:space="preserve">08_Steuer</w:t>
+            </w:r>
+          </w:p>
+        </w:tc>
+        <w:tc>
+          <w:tcPr>
+            <w:tcW w:type="dxa" w:w="6626"/>
+            <w:tcBorders>
+              <w:top w:val="single" w:color="D9DEE8" w:sz="4"/>
+              <w:left w:val="single" w:color="D9DEE8" w:sz="4"/>
+              <w:bottom w:val="single" w:color="D9DEE8" w:sz="4"/>
+              <w:right w:val="single" w:color="D9DEE8" w:sz="4"/>
+            </w:tcBorders>
+            <w:shd w:fill="FFFFFF" w:val="clear"/>
+            <w:tcMar>
+              <w:top w:type="dxa" w:w="90"/>
+              <w:left w:type="dxa" w:w="140"/>
+              <w:bottom w:type="dxa" w:w="90"/>
+              <w:right w:type="dxa" w:w="120"/>
+            </w:tcMar>
+          </w:tcPr>
+          <w:p>
+            <w:pPr>
+              <w:spacing w:after="0"/>
+            </w:pPr>
+            <w:r>
+              <w:rPr>
+                <w:color w:val="1A2233"/>
+                <w:sz w:val="20"/>
+                <w:szCs w:val="20"/>
+              </w:rPr>
+              <w:t xml:space="preserve">Anlage V / Feststellung je Jahr</w:t>
+            </w:r>
+          </w:p>
+        </w:tc>
+      </w:tr>
+      <w:tr>
+        <w:tc>
+          <w:tcPr>
+            <w:tcW w:type="dxa" w:w="2400"/>
+            <w:tcBorders>
+              <w:top w:val="single" w:color="D9DEE8" w:sz="4"/>
+              <w:left w:val="single" w:color="D9DEE8" w:sz="4"/>
+              <w:bottom w:val="single" w:color="D9DEE8" w:sz="4"/>
+              <w:right w:val="single" w:color="D9DEE8" w:sz="4"/>
+            </w:tcBorders>
+            <w:shd w:fill="FFFFFF" w:val="clear"/>
+            <w:tcMar>
+              <w:top w:type="dxa" w:w="90"/>
+              <w:left w:type="dxa" w:w="140"/>
+              <w:bottom w:type="dxa" w:w="90"/>
+              <w:right w:type="dxa" w:w="120"/>
+            </w:tcMar>
+          </w:tcPr>
+          <w:p>
+            <w:pPr>
+              <w:spacing w:after="0"/>
+            </w:pPr>
+            <w:r>
+              <w:rPr>
+                <w:b/>
+                <w:bCs/>
+                <w:color w:val="1A2233"/>
+                <w:sz w:val="20"/>
+                <w:szCs w:val="20"/>
+              </w:rPr>
+              <w:t xml:space="preserve">09_Konto</w:t>
+            </w:r>
+          </w:p>
+        </w:tc>
+        <w:tc>
+          <w:tcPr>
+            <w:tcW w:type="dxa" w:w="6626"/>
+            <w:tcBorders>
+              <w:top w:val="single" w:color="D9DEE8" w:sz="4"/>
+              <w:left w:val="single" w:color="D9DEE8" w:sz="4"/>
+              <w:bottom w:val="single" w:color="D9DEE8" w:sz="4"/>
+              <w:right w:val="single" w:color="D9DEE8" w:sz="4"/>
+            </w:tcBorders>
+            <w:shd w:fill="FFFFFF" w:val="clear"/>
+            <w:tcMar>
+              <w:top w:type="dxa" w:w="90"/>
+              <w:left w:type="dxa" w:w="140"/>
+              <w:bottom w:type="dxa" w:w="90"/>
+              <w:right w:type="dxa" w:w="120"/>
+            </w:tcMar>
+          </w:tcPr>
+          <w:p>
+            <w:pPr>
+              <w:spacing w:after="0"/>
+            </w:pPr>
+            <w:r>
+              <w:rPr>
+                <w:color w:val="1A2233"/>
+                <w:sz w:val="20"/>
+                <w:szCs w:val="20"/>
+              </w:rPr>
+              <w:t xml:space="preserve">Objektkonto – Auszüge, Kontoinfos</w:t>
+            </w:r>
+          </w:p>
+        </w:tc>
+      </w:tr>
+    </w:tbl>
+    <w:p>
+      <w:pPr>
+        <w:pBdr>
+          <w:top w:val="single" w:color="F0DCB4" w:sz="2"/>
+          <w:bottom w:val="single" w:color="F0DCB4" w:sz="2"/>
+          <w:left w:val="single" w:color="9A7B22" w:sz="18" w:space="10"/>
+          <w:right w:val="single" w:color="F0DCB4" w:sz="2"/>
+        </w:pBdr>
+        <w:shd w:fill="FFF8EC" w:val="clear"/>
+        <w:spacing w:after="0" w:before="140"/>
       </w:pPr>
       <w:r>
         <w:rPr>
           <w:b/>
           <w:bCs/>
+          <w:color w:val="5C4615"/>
+          <w:sz w:val="21"/>
+          <w:szCs w:val="21"/>
+        </w:rPr>
+        <w:t xml:space="preserve">Steuer-Kernregel:  </w:t>
+      </w:r>
+      <w:r>
+        <w:rPr>
+          <w:color w:val="5C4615"/>
+          <w:sz w:val="21"/>
+          <w:szCs w:val="21"/>
+        </w:rPr>
+        <w:t xml:space="preserve">Reparaturen und Modernisierung strikt getrennt ablegen – wegen der 15-%-Grenze für anschaffungsnahe Herstellungskosten (§ 6 Abs. 1 Nr. 1a EStG) in den ersten drei Jahren nach Kauf.</w:t>
+      </w:r>
+    </w:p>
+    <w:p>
+      <w:pPr>
+        <w:pStyle w:val="Heading1"/>
+      </w:pPr>
+      <w:r>
+        <w:t xml:space="preserve">Die Einheiten-Ebene – Wohnungen &amp; Mieter</w:t>
+      </w:r>
+    </w:p>
+    <w:p>
+      <w:pPr>
+        <w:spacing w:after="120"/>
+      </w:pPr>
+      <w:r>
+        <w:rPr>
           <w:sz w:val="22"/>
           <w:szCs w:val="22"/>
         </w:rPr>
-        <w:t xml:space="preserve">Benennung: </w:t>
-      </w:r>
-      <w:r>
-        <w:rPr>
-          <w:sz w:val="22"/>
-          <w:szCs w:val="22"/>
-        </w:rPr>
-        <w:t xml:space="preserve">JJJJ-MM – heute · Name (aktueller Mieter), JJJJ-MM – JJJJ-MM · Name (Vormieter). Das Wort „heute“ markiert den aktuellen Mieter.</w:t>
-      </w:r>
-    </w:p>
-    <w:p>
-      <w:pPr>
-        <w:pStyle w:val="ListParagraph"/>
-        <w:numPr>
-          <w:ilvl w:val="0"/>
-          <w:numId w:val="2"/>
-        </w:numPr>
-        <w:spacing w:after="60"/>
-      </w:pPr>
-      <w:r>
-        <w:rPr>
-          <w:b/>
-          <w:bCs/>
-          <w:sz w:val="22"/>
-          <w:szCs w:val="22"/>
-        </w:rPr>
-        <w:t xml:space="preserve">Mieterwechsel = 2 Handgriffe: </w:t>
-      </w:r>
-      <w:r>
-        <w:rPr>
-          <w:sz w:val="22"/>
-          <w:szCs w:val="22"/>
-        </w:rPr>
-        <w:t xml:space="preserve">„heute“ durch das Auszugsdatum ersetzen (Ordner bleibt liegen, nichts löschen) und neuen Mieter-Ordner anlegen.</w:t>
-      </w:r>
-    </w:p>
-    <w:p>
-      <w:pPr>
-        <w:pStyle w:val="ListParagraph"/>
-        <w:numPr>
-          <w:ilvl w:val="0"/>
-          <w:numId w:val="2"/>
-        </w:numPr>
-        <w:spacing w:after="60"/>
-      </w:pPr>
-      <w:r>
-        <w:rPr>
-          <w:b/>
-          <w:bCs/>
-          <w:sz w:val="22"/>
-          <w:szCs w:val="22"/>
-        </w:rPr>
-        <w:t xml:space="preserve">Belege bleiben in 06_Belege: </w:t>
-      </w:r>
-      <w:r>
-        <w:rPr>
-          <w:sz w:val="22"/>
-          <w:szCs w:val="22"/>
-        </w:rPr>
-        <w:t xml:space="preserve">Rechnungen – auch Renovierung nach Auszug – gehören zur Buchhaltung/Steuer, nicht in den Mieter-Ordner.</w:t>
-      </w:r>
-    </w:p>
-    <w:p>
-      <w:pPr>
-        <w:pStyle w:val="Heading1"/>
-        <w:pageBreakBefore/>
-      </w:pPr>
-      <w:r>
-        <w:t xml:space="preserve">Drei Anwendungsfälle aus der Praxis</w:t>
-      </w:r>
-    </w:p>
-    <w:p>
-      <w:pPr>
-        <w:spacing w:after="100"/>
-      </w:pPr>
-      <w:r>
-        <w:rPr>
-          <w:sz w:val="22"/>
-          <w:szCs w:val="22"/>
-        </w:rPr>
-        <w:t xml:space="preserve">Dasselbe System, drei Strategien – damit du dich wiederfindest, egal wie du investierst. Buy &amp; Hold siehst du oben; hier Fix &amp; Flip und Kurzzeit.</w:t>
-      </w:r>
-    </w:p>
-    <w:p>
-      <w:pPr>
-        <w:spacing w:after="40"/>
-      </w:pPr>
-      <w:r>
-        <w:rPr>
-          <w:sz w:val="20"/>
-          <w:szCs w:val="20"/>
-        </w:rPr>
-        <w:t xml:space="preserve">Fix &amp; Flip: kaufen, sanieren, verkaufen. Das Objekt wandert 0_Ankauf → 1_Bestand → 2_Verkauft, der Verkauf bekommt einen eigenen Strang.</w:t>
+        <w:t xml:space="preserve">Jede Wohnung ist ein stabiler Ordner. Darin liegt die Mieter-Chronik: pro Mieter ein datierter Ordner – so siehst du auf einen Blick, wer wann in der Wohnung wohnte, und behältst jede Mietakte.</w:t>
       </w:r>
     </w:p>
     <w:p>
@@ -1507,7 +1426,7 @@
       <w:r>
         <w:drawing>
           <wp:inline distT="0" distB="0" distL="0" distR="0">
-            <wp:extent cx="4953000" cy="5524500"/>
+            <wp:extent cx="5143500" cy="2971800"/>
             <wp:effectExtent t="0" r="0" b="0" l="0"/>
             <wp:docPr id="1" name="finder" descr="macOS Finder Beispielansicht der Ordnerstruktur" title="Finder-Beispiel"/>
             <wp:cNvGraphicFramePr>
@@ -1532,7 +1451,7 @@
                   <pic:spPr bwMode="auto">
                     <a:xfrm>
                       <a:off x="0" y="0"/>
-                      <a:ext cx="4953000" cy="5524500"/>
+                      <a:ext cx="5143500" cy="2971800"/>
                     </a:xfrm>
                     <a:prstGeom prst="rect">
                       <a:avLst/>
@@ -1558,7 +1477,118 @@
           <w:sz w:val="16"/>
           <w:szCs w:val="16"/>
         </w:rPr>
-        <w:t xml:space="preserve">Fix &amp; Flip – kompletter Lebenszyklus vom Ankauf bis zum Verkauf</w:t>
+        <w:t xml:space="preserve">Pro Wohnung eine chronologische Mieter-Liste – nichts wird gelöscht</w:t>
+      </w:r>
+    </w:p>
+    <w:p>
+      <w:pPr>
+        <w:spacing w:after="80"/>
+      </w:pPr>
+      <w:r>
+        <w:rPr>
+          <w:sz w:val="22"/>
+          <w:szCs w:val="22"/>
+        </w:rPr>
+        <w:t xml:space="preserve">Pro Mieter-Ordner: Mietvertrag, Selbstauskunft/Bonität, Kaution, Übergabe (Ein+Aus), Mieterhöhungen, Korrespondenz.</w:t>
+      </w:r>
+    </w:p>
+    <w:p>
+      <w:pPr>
+        <w:pStyle w:val="ListParagraph"/>
+        <w:numPr>
+          <w:ilvl w:val="0"/>
+          <w:numId w:val="2"/>
+        </w:numPr>
+        <w:spacing w:after="60"/>
+      </w:pPr>
+      <w:r>
+        <w:rPr>
+          <w:b/>
+          <w:bCs/>
+          <w:sz w:val="22"/>
+          <w:szCs w:val="22"/>
+        </w:rPr>
+        <w:t xml:space="preserve">Benennung: </w:t>
+      </w:r>
+      <w:r>
+        <w:rPr>
+          <w:sz w:val="22"/>
+          <w:szCs w:val="22"/>
+        </w:rPr>
+        <w:t xml:space="preserve">JJJJ-MM – heute · Name (aktueller Mieter), JJJJ-MM – JJJJ-MM · Name (Vormieter). Das Wort „heute“ markiert den aktuellen Mieter.</w:t>
+      </w:r>
+    </w:p>
+    <w:p>
+      <w:pPr>
+        <w:pStyle w:val="ListParagraph"/>
+        <w:numPr>
+          <w:ilvl w:val="0"/>
+          <w:numId w:val="2"/>
+        </w:numPr>
+        <w:spacing w:after="60"/>
+      </w:pPr>
+      <w:r>
+        <w:rPr>
+          <w:b/>
+          <w:bCs/>
+          <w:sz w:val="22"/>
+          <w:szCs w:val="22"/>
+        </w:rPr>
+        <w:t xml:space="preserve">Mieterwechsel = 2 Handgriffe: </w:t>
+      </w:r>
+      <w:r>
+        <w:rPr>
+          <w:sz w:val="22"/>
+          <w:szCs w:val="22"/>
+        </w:rPr>
+        <w:t xml:space="preserve">„heute“ durch das Auszugsdatum ersetzen (Ordner bleibt liegen, nichts löschen) und neuen Mieter-Ordner anlegen.</w:t>
+      </w:r>
+    </w:p>
+    <w:p>
+      <w:pPr>
+        <w:pStyle w:val="ListParagraph"/>
+        <w:numPr>
+          <w:ilvl w:val="0"/>
+          <w:numId w:val="2"/>
+        </w:numPr>
+        <w:spacing w:after="60"/>
+      </w:pPr>
+      <w:r>
+        <w:rPr>
+          <w:b/>
+          <w:bCs/>
+          <w:sz w:val="22"/>
+          <w:szCs w:val="22"/>
+        </w:rPr>
+        <w:t xml:space="preserve">Belege bleiben in 06_Belege: </w:t>
+      </w:r>
+      <w:r>
+        <w:rPr>
+          <w:sz w:val="22"/>
+          <w:szCs w:val="22"/>
+        </w:rPr>
+        <w:t xml:space="preserve">Rechnungen – auch Renovierung nach Auszug – gehören zur Buchhaltung/Steuer, nicht in den Mieter-Ordner.</w:t>
+      </w:r>
+    </w:p>
+    <w:p>
+      <w:pPr>
+        <w:pStyle w:val="Heading1"/>
+        <w:pageBreakBefore/>
+      </w:pPr>
+      <w:r>
+        <w:t xml:space="preserve">Anwendungsfälle aus der Praxis</w:t>
+      </w:r>
+    </w:p>
+    <w:p>
+      <w:pPr>
+        <w:spacing w:after="100"/>
+      </w:pPr>
+      <w:r>
+        <w:rPr>
+          <w:sz w:val="22"/>
+          <w:szCs w:val="22"/>
+        </w:rPr>
+        <w:t xml:space="preserve">Dasselbe System, jede Strategie – damit du dich wiederfindest, egal wie du investierst. Buy &amp; Hold siehst du oben; hier Fix &amp; Flip, Kurzzeit und die einzelne Eigentumswohnung.</w:t>
       </w:r>
     </w:p>
     <w:p>
@@ -1570,7 +1600,7 @@
           <w:sz w:val="20"/>
           <w:szCs w:val="20"/>
         </w:rPr>
-        <w:t xml:space="preserve">Kurzzeitvermietung: Plattform-Abrechnungen (Airbnb/Booking) in den Belegen, Umsatzsteuer in der Steuer.</w:t>
+        <w:t xml:space="preserve">Fix &amp; Flip: kaufen, sanieren, verkaufen. Das Objekt wandert 0_Ankauf → 1_Bestand → 2_Verkauft, der Verkauf bekommt einen eigenen Strang.</w:t>
       </w:r>
     </w:p>
     <w:p>
@@ -1583,7 +1613,7 @@
       <w:r>
         <w:drawing>
           <wp:inline distT="0" distB="0" distL="0" distR="0">
-            <wp:extent cx="4953000" cy="3762375"/>
+            <wp:extent cx="4953000" cy="5524500"/>
             <wp:effectExtent t="0" r="0" b="0" l="0"/>
             <wp:docPr id="1" name="finder" descr="macOS Finder Beispielansicht der Ordnerstruktur" title="Finder-Beispiel"/>
             <wp:cNvGraphicFramePr>
@@ -1608,6 +1638,82 @@
                   <pic:spPr bwMode="auto">
                     <a:xfrm>
                       <a:off x="0" y="0"/>
+                      <a:ext cx="4953000" cy="5524500"/>
+                    </a:xfrm>
+                    <a:prstGeom prst="rect">
+                      <a:avLst/>
+                    </a:prstGeom>
+                  </pic:spPr>
+                </pic:pic>
+              </a:graphicData>
+            </a:graphic>
+          </wp:inline>
+        </w:drawing>
+      </w:r>
+    </w:p>
+    <w:p>
+      <w:pPr>
+        <w:spacing w:after="140"/>
+        <w:jc w:val="center"/>
+      </w:pPr>
+      <w:r>
+        <w:rPr>
+          <w:i/>
+          <w:iCs/>
+          <w:color w:val="5B6678"/>
+          <w:sz w:val="16"/>
+          <w:szCs w:val="16"/>
+        </w:rPr>
+        <w:t xml:space="preserve">Fix &amp; Flip – kompletter Lebenszyklus vom Ankauf bis zum Verkauf</w:t>
+      </w:r>
+    </w:p>
+    <w:p>
+      <w:pPr>
+        <w:spacing w:after="40"/>
+      </w:pPr>
+      <w:r>
+        <w:rPr>
+          <w:sz w:val="20"/>
+          <w:szCs w:val="20"/>
+        </w:rPr>
+        <w:t xml:space="preserve">Kurzzeitvermietung: Plattform-Abrechnungen (Airbnb/Booking) in den Belegen, Umsatzsteuer in der Steuer.</w:t>
+      </w:r>
+    </w:p>
+    <w:p>
+      <w:pPr>
+        <w:keepNext/>
+        <w:keepLines/>
+        <w:spacing w:after="60" w:before="80"/>
+        <w:jc w:val="center"/>
+      </w:pPr>
+      <w:r>
+        <w:drawing>
+          <wp:inline distT="0" distB="0" distL="0" distR="0">
+            <wp:extent cx="4953000" cy="3762375"/>
+            <wp:effectExtent t="0" r="0" b="0" l="0"/>
+            <wp:docPr id="1" name="finder" descr="macOS Finder Beispielansicht der Ordnerstruktur" title="Finder-Beispiel"/>
+            <wp:cNvGraphicFramePr>
+              <a:graphicFrameLocks xmlns:a="http://schemas.openxmlformats.org/drawingml/2006/main" noChangeAspect="1"/>
+            </wp:cNvGraphicFramePr>
+            <a:graphic xmlns:a="http://schemas.openxmlformats.org/drawingml/2006/main">
+              <a:graphicData uri="http://schemas.openxmlformats.org/drawingml/2006/picture">
+                <pic:pic xmlns:pic="http://schemas.openxmlformats.org/drawingml/2006/picture">
+                  <pic:nvPicPr>
+                    <pic:cNvPr id="0" name="" descr=""/>
+                    <pic:cNvPicPr>
+                      <a:picLocks noChangeAspect="1" noChangeArrowheads="1"/>
+                    </pic:cNvPicPr>
+                  </pic:nvPicPr>
+                  <pic:blipFill>
+                    <a:blip r:embed="rId13" cstate="none"/>
+                    <a:srcRect/>
+                    <a:stretch>
+                      <a:fillRect/>
+                    </a:stretch>
+                  </pic:blipFill>
+                  <pic:spPr bwMode="auto">
+                    <a:xfrm>
+                      <a:off x="0" y="0"/>
                       <a:ext cx="4953000" cy="3762375"/>
                     </a:xfrm>
                     <a:prstGeom prst="rect">
@@ -1635,6 +1741,82 @@
           <w:szCs w:val="16"/>
         </w:rPr>
         <w:t xml:space="preserve">Kurzzeitvermietung – mit Umsatzsteuer und Plattform-Abrechnungen</w:t>
+      </w:r>
+    </w:p>
+    <w:p>
+      <w:pPr>
+        <w:spacing w:after="40"/>
+      </w:pPr>
+      <w:r>
+        <w:rPr>
+          <w:sz w:val="20"/>
+          <w:szCs w:val="20"/>
+        </w:rPr>
+        <w:t xml:space="preserve">Einzelne Eigentumswohnung: für Einsteiger mit ein, zwei Wohnungen – ohne Firmen-Ebene, dafür mit WEG-Unterlagen (Hausgeld, Protokolle, Wirtschaftsplan).</w:t>
+      </w:r>
+    </w:p>
+    <w:p>
+      <w:pPr>
+        <w:keepNext/>
+        <w:keepLines/>
+        <w:spacing w:after="60" w:before="80"/>
+        <w:jc w:val="center"/>
+      </w:pPr>
+      <w:r>
+        <w:drawing>
+          <wp:inline distT="0" distB="0" distL="0" distR="0">
+            <wp:extent cx="4762500" cy="4095750"/>
+            <wp:effectExtent t="0" r="0" b="0" l="0"/>
+            <wp:docPr id="1" name="finder" descr="macOS Finder Beispielansicht der Ordnerstruktur" title="Finder-Beispiel"/>
+            <wp:cNvGraphicFramePr>
+              <a:graphicFrameLocks xmlns:a="http://schemas.openxmlformats.org/drawingml/2006/main" noChangeAspect="1"/>
+            </wp:cNvGraphicFramePr>
+            <a:graphic xmlns:a="http://schemas.openxmlformats.org/drawingml/2006/main">
+              <a:graphicData uri="http://schemas.openxmlformats.org/drawingml/2006/picture">
+                <pic:pic xmlns:pic="http://schemas.openxmlformats.org/drawingml/2006/picture">
+                  <pic:nvPicPr>
+                    <pic:cNvPr id="0" name="" descr=""/>
+                    <pic:cNvPicPr>
+                      <a:picLocks noChangeAspect="1" noChangeArrowheads="1"/>
+                    </pic:cNvPicPr>
+                  </pic:nvPicPr>
+                  <pic:blipFill>
+                    <a:blip r:embed="rId14" cstate="none"/>
+                    <a:srcRect/>
+                    <a:stretch>
+                      <a:fillRect/>
+                    </a:stretch>
+                  </pic:blipFill>
+                  <pic:spPr bwMode="auto">
+                    <a:xfrm>
+                      <a:off x="0" y="0"/>
+                      <a:ext cx="4762500" cy="4095750"/>
+                    </a:xfrm>
+                    <a:prstGeom prst="rect">
+                      <a:avLst/>
+                    </a:prstGeom>
+                  </pic:spPr>
+                </pic:pic>
+              </a:graphicData>
+            </a:graphic>
+          </wp:inline>
+        </w:drawing>
+      </w:r>
+    </w:p>
+    <w:p>
+      <w:pPr>
+        <w:spacing w:after="140"/>
+        <w:jc w:val="center"/>
+      </w:pPr>
+      <w:r>
+        <w:rPr>
+          <w:i/>
+          <w:iCs/>
+          <w:color w:val="5B6678"/>
+          <w:sz w:val="16"/>
+          <w:szCs w:val="16"/>
+        </w:rPr>
+        <w:t xml:space="preserve">Einzelne Eigentumswohnung – schlank, aber nach demselben System</w:t>
       </w:r>
     </w:p>
     <w:p>
@@ -1977,7 +2159,7 @@
         </w:rPr>
         <w:t xml:space="preserve">immoJUMP nutzen: </w:t>
       </w:r>
-      <w:hyperlink w:history="1" r:id="rId5ss8wyew0cvymetco1q7r">
+      <w:hyperlink w:history="1" r:id="rIdng99u1c5vq6itxaitiee2">
         <w:r>
           <w:rPr>
             <w:rStyle w:val="Hyperlink"/>
@@ -1995,7 +2177,7 @@
         </w:rPr>
         <w:t xml:space="preserve">   ·   Mehr erfahren: </w:t>
       </w:r>
-      <w:hyperlink w:history="1" r:id="rIdzpdkxjp5e5vsgtmyq8a2n">
+      <w:hyperlink w:history="1" r:id="rId1jwodgeamlpg0l1wdgkyk">
         <w:r>
           <w:rPr>
             <w:rStyle w:val="Hyperlink"/>
@@ -2013,7 +2195,7 @@
         </w:rPr>
         <w:t xml:space="preserve">   ·   </w:t>
       </w:r>
-      <w:hyperlink w:history="1" r:id="rId9s_ixilgxpcyodbuw9n8g">
+      <w:hyperlink w:history="1" r:id="rIdt0ossm6p8qhrqwnm2cgjj">
         <w:r>
           <w:rPr>
             <w:rStyle w:val="Hyperlink"/>

</xml_diff>

<commit_message>
feat(docs): Objekt-Vorlage als Finder-Screenshot statt Tabelle
Die 00-09-Tabelle im Word/PDF durch einen Finder-Screenshot mit Beispiel-Inhalten
ersetzt (aus einem Guss mit den uebrigen Mac-Ansichten); doppeltes Objekt-Bild
in der Finder-Sektion entfernt. Screenshot-Asset unter docs/screenshots/.

Co-Authored-By: Claude Opus 4.8 <noreply@anthropic.com>
</commit_message>
<xml_diff>
--- a/docs/Immobilien-Ablage-Ordnerstruktur.docx
+++ b/docs/Immobilien-Ablage-Ordnerstruktur.docx
@@ -496,14 +496,53 @@
     </w:p>
     <w:p>
       <w:pPr>
-        <w:spacing w:after="40"/>
-      </w:pPr>
-      <w:r>
-        <w:rPr>
-          <w:sz w:val="22"/>
-          <w:szCs w:val="22"/>
-        </w:rPr>
-        <w:t xml:space="preserve">Und jedes einzelne Objekt sieht innen immer gleich aus – die Ordner 00–09:</w:t>
+        <w:pBdr>
+          <w:top w:val="single" w:color="C9DBFF" w:sz="2"/>
+          <w:bottom w:val="single" w:color="C9DBFF" w:sz="2"/>
+          <w:left w:val="single" w:color="2F6BFF" w:sz="18" w:space="10"/>
+          <w:right w:val="single" w:color="C9DBFF" w:sz="2"/>
+        </w:pBdr>
+        <w:shd w:fill="E8F0FE" w:val="clear"/>
+        <w:spacing w:after="60" w:before="40"/>
+      </w:pPr>
+      <w:r>
+        <w:rPr>
+          <w:b/>
+          <w:bCs/>
+          <w:color w:val="123A86"/>
+          <w:sz w:val="21"/>
+          <w:szCs w:val="21"/>
+        </w:rPr>
+        <w:t xml:space="preserve">Nur ein, zwei Eigentumswohnungen?  </w:t>
+      </w:r>
+      <w:r>
+        <w:rPr>
+          <w:color w:val="123A86"/>
+          <w:sz w:val="21"/>
+          <w:szCs w:val="21"/>
+        </w:rPr>
+        <w:t xml:space="preserve">Dann brauchst du die Firmen-Ebene gar nicht – deine Wohnung ist einfach ein Objekt mit den Ordnern 00–09. Genauso einfach.</w:t>
+      </w:r>
+    </w:p>
+    <w:p>
+      <w:pPr>
+        <w:pStyle w:val="Heading1"/>
+        <w:pageBreakBefore/>
+      </w:pPr>
+      <w:r>
+        <w:t xml:space="preserve">Die Objekt-Vorlage (00–09)</w:t>
+      </w:r>
+    </w:p>
+    <w:p>
+      <w:pPr>
+        <w:spacing w:after="60"/>
+      </w:pPr>
+      <w:r>
+        <w:rPr>
+          <w:sz w:val="22"/>
+          <w:szCs w:val="22"/>
+        </w:rPr>
+        <w:t xml:space="preserve">Eine einzige Vorlage für jedes Objekt. Gleiche Struktur überall – man findet sich auf jedem Objekt sofort zurecht. So sieht sie mit Beispiel-Dateien aus:</w:t>
       </w:r>
     </w:p>
     <w:p>
@@ -516,7 +555,7 @@
       <w:r>
         <w:drawing>
           <wp:inline distT="0" distB="0" distL="0" distR="0">
-            <wp:extent cx="5143500" cy="3524250"/>
+            <wp:extent cx="4572000" cy="6858000"/>
             <wp:effectExtent t="0" r="0" b="0" l="0"/>
             <wp:docPr id="1" name="finder" descr="macOS Finder Beispielansicht der Ordnerstruktur" title="Finder-Beispiel"/>
             <wp:cNvGraphicFramePr>
@@ -541,7 +580,7 @@
                   <pic:spPr bwMode="auto">
                     <a:xfrm>
                       <a:off x="0" y="0"/>
-                      <a:ext cx="5143500" cy="3524250"/>
+                      <a:ext cx="4572000" cy="6858000"/>
                     </a:xfrm>
                     <a:prstGeom prst="rect">
                       <a:avLst/>
@@ -567,805 +606,9 @@
           <w:sz w:val="16"/>
           <w:szCs w:val="16"/>
         </w:rPr>
-        <w:t xml:space="preserve">Ein Objekt im Bestand – Buy &amp; Hold</w:t>
-      </w:r>
-    </w:p>
-    <w:p>
-      <w:pPr>
-        <w:pBdr>
-          <w:top w:val="single" w:color="C9DBFF" w:sz="2"/>
-          <w:bottom w:val="single" w:color="C9DBFF" w:sz="2"/>
-          <w:left w:val="single" w:color="2F6BFF" w:sz="18" w:space="10"/>
-          <w:right w:val="single" w:color="C9DBFF" w:sz="2"/>
-        </w:pBdr>
-        <w:shd w:fill="E8F0FE" w:val="clear"/>
-        <w:spacing w:after="60" w:before="40"/>
-      </w:pPr>
-      <w:r>
-        <w:rPr>
-          <w:b/>
-          <w:bCs/>
-          <w:color w:val="123A86"/>
-          <w:sz w:val="21"/>
-          <w:szCs w:val="21"/>
-        </w:rPr>
-        <w:t xml:space="preserve">Nur ein, zwei Eigentumswohnungen?  </w:t>
-      </w:r>
-      <w:r>
-        <w:rPr>
-          <w:color w:val="123A86"/>
-          <w:sz w:val="21"/>
-          <w:szCs w:val="21"/>
-        </w:rPr>
-        <w:t xml:space="preserve">Dann brauchst du die Firmen-Ebene gar nicht – deine Wohnung ist einfach ein Objekt mit den Ordnern 00–09. Genauso einfach.</w:t>
-      </w:r>
-    </w:p>
-    <w:p>
-      <w:pPr>
-        <w:pStyle w:val="Heading1"/>
-        <w:pageBreakBefore/>
-      </w:pPr>
-      <w:r>
-        <w:t xml:space="preserve">Die Objekt-Vorlage (00–09)</w:t>
-      </w:r>
-    </w:p>
-    <w:p>
-      <w:pPr>
-        <w:spacing w:after="120"/>
-      </w:pPr>
-      <w:r>
-        <w:rPr>
-          <w:sz w:val="22"/>
-          <w:szCs w:val="22"/>
-        </w:rPr>
-        <w:t xml:space="preserve">Eine einzige Vorlage für jedes Objekt. Gleiche Struktur überall – man findet sich auf jedem Objekt sofort zurecht.</w:t>
-      </w:r>
-    </w:p>
-    <w:tbl>
-      <w:tblPr>
-        <w:tblW w:type="dxa" w:w="9026"/>
-        <w:tblBorders>
-          <w:top w:val="single" w:color="auto" w:sz="4"/>
-          <w:left w:val="single" w:color="auto" w:sz="4"/>
-          <w:bottom w:val="single" w:color="auto" w:sz="4"/>
-          <w:right w:val="single" w:color="auto" w:sz="4"/>
-          <w:insideH w:val="single" w:color="auto" w:sz="4"/>
-          <w:insideV w:val="single" w:color="auto" w:sz="4"/>
-        </w:tblBorders>
-      </w:tblPr>
-      <w:tblGrid>
-        <w:gridCol w:w="2400"/>
-        <w:gridCol w:w="6626"/>
-      </w:tblGrid>
-      <w:tr>
-        <w:tc>
-          <w:tcPr>
-            <w:tcW w:type="dxa" w:w="2400"/>
-            <w:tcBorders>
-              <w:top w:val="single" w:color="D9DEE8" w:sz="4"/>
-              <w:left w:val="single" w:color="D9DEE8" w:sz="4"/>
-              <w:bottom w:val="single" w:color="D9DEE8" w:sz="4"/>
-              <w:right w:val="single" w:color="D9DEE8" w:sz="4"/>
-            </w:tcBorders>
-            <w:shd w:fill="1F4E79" w:val="clear"/>
-            <w:tcMar>
-              <w:top w:type="dxa" w:w="90"/>
-              <w:left w:type="dxa" w:w="140"/>
-              <w:bottom w:type="dxa" w:w="90"/>
-              <w:right w:type="dxa" w:w="120"/>
-            </w:tcMar>
-          </w:tcPr>
-          <w:p>
-            <w:pPr>
-              <w:spacing w:after="0"/>
-            </w:pPr>
-            <w:r>
-              <w:rPr>
-                <w:b/>
-                <w:bCs/>
-                <w:color w:val="FFFFFF"/>
-                <w:sz w:val="20"/>
-                <w:szCs w:val="20"/>
-              </w:rPr>
-              <w:t xml:space="preserve">Ordner</w:t>
-            </w:r>
-          </w:p>
-        </w:tc>
-        <w:tc>
-          <w:tcPr>
-            <w:tcW w:type="dxa" w:w="6626"/>
-            <w:tcBorders>
-              <w:top w:val="single" w:color="D9DEE8" w:sz="4"/>
-              <w:left w:val="single" w:color="D9DEE8" w:sz="4"/>
-              <w:bottom w:val="single" w:color="D9DEE8" w:sz="4"/>
-              <w:right w:val="single" w:color="D9DEE8" w:sz="4"/>
-            </w:tcBorders>
-            <w:shd w:fill="1F4E79" w:val="clear"/>
-            <w:tcMar>
-              <w:top w:type="dxa" w:w="90"/>
-              <w:left w:type="dxa" w:w="140"/>
-              <w:bottom w:type="dxa" w:w="90"/>
-              <w:right w:type="dxa" w:w="120"/>
-            </w:tcMar>
-          </w:tcPr>
-          <w:p>
-            <w:pPr>
-              <w:spacing w:after="0"/>
-            </w:pPr>
-            <w:r>
-              <w:rPr>
-                <w:b/>
-                <w:bCs/>
-                <w:color w:val="FFFFFF"/>
-                <w:sz w:val="20"/>
-                <w:szCs w:val="20"/>
-              </w:rPr>
-              <w:t xml:space="preserve">Inhalt</w:t>
-            </w:r>
-          </w:p>
-        </w:tc>
-      </w:tr>
-      <w:tr>
-        <w:tc>
-          <w:tcPr>
-            <w:tcW w:type="dxa" w:w="2400"/>
-            <w:tcBorders>
-              <w:top w:val="single" w:color="D9DEE8" w:sz="4"/>
-              <w:left w:val="single" w:color="D9DEE8" w:sz="4"/>
-              <w:bottom w:val="single" w:color="D9DEE8" w:sz="4"/>
-              <w:right w:val="single" w:color="D9DEE8" w:sz="4"/>
-            </w:tcBorders>
-            <w:shd w:fill="FFFFFF" w:val="clear"/>
-            <w:tcMar>
-              <w:top w:type="dxa" w:w="90"/>
-              <w:left w:type="dxa" w:w="140"/>
-              <w:bottom w:type="dxa" w:w="90"/>
-              <w:right w:type="dxa" w:w="120"/>
-            </w:tcMar>
-          </w:tcPr>
-          <w:p>
-            <w:pPr>
-              <w:spacing w:after="0"/>
-            </w:pPr>
-            <w:r>
-              <w:rPr>
-                <w:b/>
-                <w:bCs/>
-                <w:color w:val="1A2233"/>
-                <w:sz w:val="20"/>
-                <w:szCs w:val="20"/>
-              </w:rPr>
-              <w:t xml:space="preserve">00_Objektdatenblatt</w:t>
-            </w:r>
-          </w:p>
-        </w:tc>
-        <w:tc>
-          <w:tcPr>
-            <w:tcW w:type="dxa" w:w="6626"/>
-            <w:tcBorders>
-              <w:top w:val="single" w:color="D9DEE8" w:sz="4"/>
-              <w:left w:val="single" w:color="D9DEE8" w:sz="4"/>
-              <w:bottom w:val="single" w:color="D9DEE8" w:sz="4"/>
-              <w:right w:val="single" w:color="D9DEE8" w:sz="4"/>
-            </w:tcBorders>
-            <w:shd w:fill="FFFFFF" w:val="clear"/>
-            <w:tcMar>
-              <w:top w:type="dxa" w:w="90"/>
-              <w:left w:type="dxa" w:w="140"/>
-              <w:bottom w:type="dxa" w:w="90"/>
-              <w:right w:type="dxa" w:w="120"/>
-            </w:tcMar>
-          </w:tcPr>
-          <w:p>
-            <w:pPr>
-              <w:spacing w:after="0"/>
-            </w:pPr>
-            <w:r>
-              <w:rPr>
-                <w:color w:val="1A2233"/>
-                <w:sz w:val="20"/>
-                <w:szCs w:val="20"/>
-              </w:rPr>
-              <w:t xml:space="preserve">Eckdaten, Kürzel, Fläche, Baujahr, Kaufdatum, AfA-Basis, Zählernummern</w:t>
-            </w:r>
-          </w:p>
-        </w:tc>
-      </w:tr>
-      <w:tr>
-        <w:tc>
-          <w:tcPr>
-            <w:tcW w:type="dxa" w:w="2400"/>
-            <w:tcBorders>
-              <w:top w:val="single" w:color="D9DEE8" w:sz="4"/>
-              <w:left w:val="single" w:color="D9DEE8" w:sz="4"/>
-              <w:bottom w:val="single" w:color="D9DEE8" w:sz="4"/>
-              <w:right w:val="single" w:color="D9DEE8" w:sz="4"/>
-            </w:tcBorders>
-            <w:shd w:fill="FFFFFF" w:val="clear"/>
-            <w:tcMar>
-              <w:top w:type="dxa" w:w="90"/>
-              <w:left w:type="dxa" w:w="140"/>
-              <w:bottom w:type="dxa" w:w="90"/>
-              <w:right w:type="dxa" w:w="120"/>
-            </w:tcMar>
-          </w:tcPr>
-          <w:p>
-            <w:pPr>
-              <w:spacing w:after="0"/>
-            </w:pPr>
-            <w:r>
-              <w:rPr>
-                <w:b/>
-                <w:bCs/>
-                <w:color w:val="1A2233"/>
-                <w:sz w:val="20"/>
-                <w:szCs w:val="20"/>
-              </w:rPr>
-              <w:t xml:space="preserve">01_Stammdaten</w:t>
-            </w:r>
-          </w:p>
-        </w:tc>
-        <w:tc>
-          <w:tcPr>
-            <w:tcW w:type="dxa" w:w="6626"/>
-            <w:tcBorders>
-              <w:top w:val="single" w:color="D9DEE8" w:sz="4"/>
-              <w:left w:val="single" w:color="D9DEE8" w:sz="4"/>
-              <w:bottom w:val="single" w:color="D9DEE8" w:sz="4"/>
-              <w:right w:val="single" w:color="D9DEE8" w:sz="4"/>
-            </w:tcBorders>
-            <w:shd w:fill="FFFFFF" w:val="clear"/>
-            <w:tcMar>
-              <w:top w:type="dxa" w:w="90"/>
-              <w:left w:type="dxa" w:w="140"/>
-              <w:bottom w:type="dxa" w:w="90"/>
-              <w:right w:type="dxa" w:w="120"/>
-            </w:tcMar>
-          </w:tcPr>
-          <w:p>
-            <w:pPr>
-              <w:spacing w:after="0"/>
-            </w:pPr>
-            <w:r>
-              <w:rPr>
-                <w:color w:val="1A2233"/>
-                <w:sz w:val="20"/>
-                <w:szCs w:val="20"/>
-              </w:rPr>
-              <w:t xml:space="preserve">Grundbuch, Pläne, Lageplan, Wohnflächenberechnung, Energieausweis, Teilungserklärung</w:t>
-            </w:r>
-          </w:p>
-        </w:tc>
-      </w:tr>
-      <w:tr>
-        <w:tc>
-          <w:tcPr>
-            <w:tcW w:type="dxa" w:w="2400"/>
-            <w:tcBorders>
-              <w:top w:val="single" w:color="D9DEE8" w:sz="4"/>
-              <w:left w:val="single" w:color="D9DEE8" w:sz="4"/>
-              <w:bottom w:val="single" w:color="D9DEE8" w:sz="4"/>
-              <w:right w:val="single" w:color="D9DEE8" w:sz="4"/>
-            </w:tcBorders>
-            <w:shd w:fill="FFFFFF" w:val="clear"/>
-            <w:tcMar>
-              <w:top w:type="dxa" w:w="90"/>
-              <w:left w:type="dxa" w:w="140"/>
-              <w:bottom w:type="dxa" w:w="90"/>
-              <w:right w:type="dxa" w:w="120"/>
-            </w:tcMar>
-          </w:tcPr>
-          <w:p>
-            <w:pPr>
-              <w:spacing w:after="0"/>
-            </w:pPr>
-            <w:r>
-              <w:rPr>
-                <w:b/>
-                <w:bCs/>
-                <w:color w:val="1A2233"/>
-                <w:sz w:val="20"/>
-                <w:szCs w:val="20"/>
-              </w:rPr>
-              <w:t xml:space="preserve">02_Kaufprozess</w:t>
-            </w:r>
-          </w:p>
-        </w:tc>
-        <w:tc>
-          <w:tcPr>
-            <w:tcW w:type="dxa" w:w="6626"/>
-            <w:tcBorders>
-              <w:top w:val="single" w:color="D9DEE8" w:sz="4"/>
-              <w:left w:val="single" w:color="D9DEE8" w:sz="4"/>
-              <w:bottom w:val="single" w:color="D9DEE8" w:sz="4"/>
-              <w:right w:val="single" w:color="D9DEE8" w:sz="4"/>
-            </w:tcBorders>
-            <w:shd w:fill="FFFFFF" w:val="clear"/>
-            <w:tcMar>
-              <w:top w:type="dxa" w:w="90"/>
-              <w:left w:type="dxa" w:w="140"/>
-              <w:bottom w:type="dxa" w:w="90"/>
-              <w:right w:type="dxa" w:w="120"/>
-            </w:tcMar>
-          </w:tcPr>
-          <w:p>
-            <w:pPr>
-              <w:spacing w:after="0"/>
-            </w:pPr>
-            <w:r>
-              <w:rPr>
-                <w:color w:val="1A2233"/>
-                <w:sz w:val="20"/>
-                <w:szCs w:val="20"/>
-              </w:rPr>
-              <w:t xml:space="preserve">Exposé, Notar/Kaufvertrag, Kaufpreisaufteilung, Kaufnebenkosten</w:t>
-            </w:r>
-          </w:p>
-        </w:tc>
-      </w:tr>
-      <w:tr>
-        <w:tc>
-          <w:tcPr>
-            <w:tcW w:type="dxa" w:w="2400"/>
-            <w:tcBorders>
-              <w:top w:val="single" w:color="D9DEE8" w:sz="4"/>
-              <w:left w:val="single" w:color="D9DEE8" w:sz="4"/>
-              <w:bottom w:val="single" w:color="D9DEE8" w:sz="4"/>
-              <w:right w:val="single" w:color="D9DEE8" w:sz="4"/>
-            </w:tcBorders>
-            <w:shd w:fill="FFFFFF" w:val="clear"/>
-            <w:tcMar>
-              <w:top w:type="dxa" w:w="90"/>
-              <w:left w:type="dxa" w:w="140"/>
-              <w:bottom w:type="dxa" w:w="90"/>
-              <w:right w:type="dxa" w:w="120"/>
-            </w:tcMar>
-          </w:tcPr>
-          <w:p>
-            <w:pPr>
-              <w:spacing w:after="0"/>
-            </w:pPr>
-            <w:r>
-              <w:rPr>
-                <w:b/>
-                <w:bCs/>
-                <w:color w:val="1A2233"/>
-                <w:sz w:val="20"/>
-                <w:szCs w:val="20"/>
-              </w:rPr>
-              <w:t xml:space="preserve">03_Finanzierung</w:t>
-            </w:r>
-          </w:p>
-        </w:tc>
-        <w:tc>
-          <w:tcPr>
-            <w:tcW w:type="dxa" w:w="6626"/>
-            <w:tcBorders>
-              <w:top w:val="single" w:color="D9DEE8" w:sz="4"/>
-              <w:left w:val="single" w:color="D9DEE8" w:sz="4"/>
-              <w:bottom w:val="single" w:color="D9DEE8" w:sz="4"/>
-              <w:right w:val="single" w:color="D9DEE8" w:sz="4"/>
-            </w:tcBorders>
-            <w:shd w:fill="FFFFFF" w:val="clear"/>
-            <w:tcMar>
-              <w:top w:type="dxa" w:w="90"/>
-              <w:left w:type="dxa" w:w="140"/>
-              <w:bottom w:type="dxa" w:w="90"/>
-              <w:right w:type="dxa" w:w="120"/>
-            </w:tcMar>
-          </w:tcPr>
-          <w:p>
-            <w:pPr>
-              <w:spacing w:after="0"/>
-            </w:pPr>
-            <w:r>
-              <w:rPr>
-                <w:color w:val="1A2233"/>
-                <w:sz w:val="20"/>
-                <w:szCs w:val="20"/>
-              </w:rPr>
-              <w:t xml:space="preserve">Darlehensverträge, Grundschuld, Tilgungspläne, Zinsbescheinigungen</w:t>
-            </w:r>
-          </w:p>
-        </w:tc>
-      </w:tr>
-      <w:tr>
-        <w:tc>
-          <w:tcPr>
-            <w:tcW w:type="dxa" w:w="2400"/>
-            <w:tcBorders>
-              <w:top w:val="single" w:color="D9DEE8" w:sz="4"/>
-              <w:left w:val="single" w:color="D9DEE8" w:sz="4"/>
-              <w:bottom w:val="single" w:color="D9DEE8" w:sz="4"/>
-              <w:right w:val="single" w:color="D9DEE8" w:sz="4"/>
-            </w:tcBorders>
-            <w:shd w:fill="FFFFFF" w:val="clear"/>
-            <w:tcMar>
-              <w:top w:type="dxa" w:w="90"/>
-              <w:left w:type="dxa" w:w="140"/>
-              <w:bottom w:type="dxa" w:w="90"/>
-              <w:right w:type="dxa" w:w="120"/>
-            </w:tcMar>
-          </w:tcPr>
-          <w:p>
-            <w:pPr>
-              <w:spacing w:after="0"/>
-            </w:pPr>
-            <w:r>
-              <w:rPr>
-                <w:b/>
-                <w:bCs/>
-                <w:color w:val="1A2233"/>
-                <w:sz w:val="20"/>
-                <w:szCs w:val="20"/>
-              </w:rPr>
-              <w:t xml:space="preserve">04_Einheiten</w:t>
-            </w:r>
-          </w:p>
-        </w:tc>
-        <w:tc>
-          <w:tcPr>
-            <w:tcW w:type="dxa" w:w="6626"/>
-            <w:tcBorders>
-              <w:top w:val="single" w:color="D9DEE8" w:sz="4"/>
-              <w:left w:val="single" w:color="D9DEE8" w:sz="4"/>
-              <w:bottom w:val="single" w:color="D9DEE8" w:sz="4"/>
-              <w:right w:val="single" w:color="D9DEE8" w:sz="4"/>
-            </w:tcBorders>
-            <w:shd w:fill="FFFFFF" w:val="clear"/>
-            <w:tcMar>
-              <w:top w:type="dxa" w:w="90"/>
-              <w:left w:type="dxa" w:w="140"/>
-              <w:bottom w:type="dxa" w:w="90"/>
-              <w:right w:type="dxa" w:w="120"/>
-            </w:tcMar>
-          </w:tcPr>
-          <w:p>
-            <w:pPr>
-              <w:spacing w:after="0"/>
-            </w:pPr>
-            <w:r>
-              <w:rPr>
-                <w:color w:val="1A2233"/>
-                <w:sz w:val="20"/>
-                <w:szCs w:val="20"/>
-              </w:rPr>
-              <w:t xml:space="preserve">Je Wohnung ein Ordner mit Mieter-Chronik (s.u.): pro Mieter eine datierte Mietakte</w:t>
-            </w:r>
-          </w:p>
-        </w:tc>
-      </w:tr>
-      <w:tr>
-        <w:tc>
-          <w:tcPr>
-            <w:tcW w:type="dxa" w:w="2400"/>
-            <w:tcBorders>
-              <w:top w:val="single" w:color="D9DEE8" w:sz="4"/>
-              <w:left w:val="single" w:color="D9DEE8" w:sz="4"/>
-              <w:bottom w:val="single" w:color="D9DEE8" w:sz="4"/>
-              <w:right w:val="single" w:color="D9DEE8" w:sz="4"/>
-            </w:tcBorders>
-            <w:shd w:fill="FFFFFF" w:val="clear"/>
-            <w:tcMar>
-              <w:top w:type="dxa" w:w="90"/>
-              <w:left w:type="dxa" w:w="140"/>
-              <w:bottom w:type="dxa" w:w="90"/>
-              <w:right w:type="dxa" w:w="120"/>
-            </w:tcMar>
-          </w:tcPr>
-          <w:p>
-            <w:pPr>
-              <w:spacing w:after="0"/>
-            </w:pPr>
-            <w:r>
-              <w:rPr>
-                <w:b/>
-                <w:bCs/>
-                <w:color w:val="1A2233"/>
-                <w:sz w:val="20"/>
-                <w:szCs w:val="20"/>
-              </w:rPr>
-              <w:t xml:space="preserve">05_Verwaltung</w:t>
-            </w:r>
-          </w:p>
-        </w:tc>
-        <w:tc>
-          <w:tcPr>
-            <w:tcW w:type="dxa" w:w="6626"/>
-            <w:tcBorders>
-              <w:top w:val="single" w:color="D9DEE8" w:sz="4"/>
-              <w:left w:val="single" w:color="D9DEE8" w:sz="4"/>
-              <w:bottom w:val="single" w:color="D9DEE8" w:sz="4"/>
-              <w:right w:val="single" w:color="D9DEE8" w:sz="4"/>
-            </w:tcBorders>
-            <w:shd w:fill="FFFFFF" w:val="clear"/>
-            <w:tcMar>
-              <w:top w:type="dxa" w:w="90"/>
-              <w:left w:type="dxa" w:w="140"/>
-              <w:bottom w:type="dxa" w:w="90"/>
-              <w:right w:type="dxa" w:w="120"/>
-            </w:tcMar>
-          </w:tcPr>
-          <w:p>
-            <w:pPr>
-              <w:spacing w:after="0"/>
-            </w:pPr>
-            <w:r>
-              <w:rPr>
-                <w:color w:val="1A2233"/>
-                <w:sz w:val="20"/>
-                <w:szCs w:val="20"/>
-              </w:rPr>
-              <w:t xml:space="preserve">Versicherung, Grundsteuer, Reparaturen, Modernisierung, Zählerstände, Fotos, WEG</w:t>
-            </w:r>
-          </w:p>
-        </w:tc>
-      </w:tr>
-      <w:tr>
-        <w:tc>
-          <w:tcPr>
-            <w:tcW w:type="dxa" w:w="2400"/>
-            <w:tcBorders>
-              <w:top w:val="single" w:color="D9DEE8" w:sz="4"/>
-              <w:left w:val="single" w:color="D9DEE8" w:sz="4"/>
-              <w:bottom w:val="single" w:color="D9DEE8" w:sz="4"/>
-              <w:right w:val="single" w:color="D9DEE8" w:sz="4"/>
-            </w:tcBorders>
-            <w:shd w:fill="FFFFFF" w:val="clear"/>
-            <w:tcMar>
-              <w:top w:type="dxa" w:w="90"/>
-              <w:left w:type="dxa" w:w="140"/>
-              <w:bottom w:type="dxa" w:w="90"/>
-              <w:right w:type="dxa" w:w="120"/>
-            </w:tcMar>
-          </w:tcPr>
-          <w:p>
-            <w:pPr>
-              <w:spacing w:after="0"/>
-            </w:pPr>
-            <w:r>
-              <w:rPr>
-                <w:b/>
-                <w:bCs/>
-                <w:color w:val="1A2233"/>
-                <w:sz w:val="20"/>
-                <w:szCs w:val="20"/>
-              </w:rPr>
-              <w:t xml:space="preserve">06_Belege</w:t>
-            </w:r>
-          </w:p>
-        </w:tc>
-        <w:tc>
-          <w:tcPr>
-            <w:tcW w:type="dxa" w:w="6626"/>
-            <w:tcBorders>
-              <w:top w:val="single" w:color="D9DEE8" w:sz="4"/>
-              <w:left w:val="single" w:color="D9DEE8" w:sz="4"/>
-              <w:bottom w:val="single" w:color="D9DEE8" w:sz="4"/>
-              <w:right w:val="single" w:color="D9DEE8" w:sz="4"/>
-            </w:tcBorders>
-            <w:shd w:fill="FFFFFF" w:val="clear"/>
-            <w:tcMar>
-              <w:top w:type="dxa" w:w="90"/>
-              <w:left w:type="dxa" w:w="140"/>
-              <w:bottom w:type="dxa" w:w="90"/>
-              <w:right w:type="dxa" w:w="120"/>
-            </w:tcMar>
-          </w:tcPr>
-          <w:p>
-            <w:pPr>
-              <w:spacing w:after="0"/>
-            </w:pPr>
-            <w:r>
-              <w:rPr>
-                <w:color w:val="1A2233"/>
-                <w:sz w:val="20"/>
-                <w:szCs w:val="20"/>
-              </w:rPr>
-              <w:t xml:space="preserve">Steuerbelege je Jahr (2024 / 2025 / …)</w:t>
-            </w:r>
-          </w:p>
-        </w:tc>
-      </w:tr>
-      <w:tr>
-        <w:tc>
-          <w:tcPr>
-            <w:tcW w:type="dxa" w:w="2400"/>
-            <w:tcBorders>
-              <w:top w:val="single" w:color="D9DEE8" w:sz="4"/>
-              <w:left w:val="single" w:color="D9DEE8" w:sz="4"/>
-              <w:bottom w:val="single" w:color="D9DEE8" w:sz="4"/>
-              <w:right w:val="single" w:color="D9DEE8" w:sz="4"/>
-            </w:tcBorders>
-            <w:shd w:fill="FFFFFF" w:val="clear"/>
-            <w:tcMar>
-              <w:top w:type="dxa" w:w="90"/>
-              <w:left w:type="dxa" w:w="140"/>
-              <w:bottom w:type="dxa" w:w="90"/>
-              <w:right w:type="dxa" w:w="120"/>
-            </w:tcMar>
-          </w:tcPr>
-          <w:p>
-            <w:pPr>
-              <w:spacing w:after="0"/>
-            </w:pPr>
-            <w:r>
-              <w:rPr>
-                <w:b/>
-                <w:bCs/>
-                <w:color w:val="1A2233"/>
-                <w:sz w:val="20"/>
-                <w:szCs w:val="20"/>
-              </w:rPr>
-              <w:t xml:space="preserve">07_Nebenkosten</w:t>
-            </w:r>
-          </w:p>
-        </w:tc>
-        <w:tc>
-          <w:tcPr>
-            <w:tcW w:type="dxa" w:w="6626"/>
-            <w:tcBorders>
-              <w:top w:val="single" w:color="D9DEE8" w:sz="4"/>
-              <w:left w:val="single" w:color="D9DEE8" w:sz="4"/>
-              <w:bottom w:val="single" w:color="D9DEE8" w:sz="4"/>
-              <w:right w:val="single" w:color="D9DEE8" w:sz="4"/>
-            </w:tcBorders>
-            <w:shd w:fill="FFFFFF" w:val="clear"/>
-            <w:tcMar>
-              <w:top w:type="dxa" w:w="90"/>
-              <w:left w:type="dxa" w:w="140"/>
-              <w:bottom w:type="dxa" w:w="90"/>
-              <w:right w:type="dxa" w:w="120"/>
-            </w:tcMar>
-          </w:tcPr>
-          <w:p>
-            <w:pPr>
-              <w:spacing w:after="0"/>
-            </w:pPr>
-            <w:r>
-              <w:rPr>
-                <w:color w:val="1A2233"/>
-                <w:sz w:val="20"/>
-                <w:szCs w:val="20"/>
-              </w:rPr>
-              <w:t xml:space="preserve">Nebenkostenabrechnungen je Jahr</w:t>
-            </w:r>
-          </w:p>
-        </w:tc>
-      </w:tr>
-      <w:tr>
-        <w:tc>
-          <w:tcPr>
-            <w:tcW w:type="dxa" w:w="2400"/>
-            <w:tcBorders>
-              <w:top w:val="single" w:color="D9DEE8" w:sz="4"/>
-              <w:left w:val="single" w:color="D9DEE8" w:sz="4"/>
-              <w:bottom w:val="single" w:color="D9DEE8" w:sz="4"/>
-              <w:right w:val="single" w:color="D9DEE8" w:sz="4"/>
-            </w:tcBorders>
-            <w:shd w:fill="FFFFFF" w:val="clear"/>
-            <w:tcMar>
-              <w:top w:type="dxa" w:w="90"/>
-              <w:left w:type="dxa" w:w="140"/>
-              <w:bottom w:type="dxa" w:w="90"/>
-              <w:right w:type="dxa" w:w="120"/>
-            </w:tcMar>
-          </w:tcPr>
-          <w:p>
-            <w:pPr>
-              <w:spacing w:after="0"/>
-            </w:pPr>
-            <w:r>
-              <w:rPr>
-                <w:b/>
-                <w:bCs/>
-                <w:color w:val="1A2233"/>
-                <w:sz w:val="20"/>
-                <w:szCs w:val="20"/>
-              </w:rPr>
-              <w:t xml:space="preserve">08_Steuer</w:t>
-            </w:r>
-          </w:p>
-        </w:tc>
-        <w:tc>
-          <w:tcPr>
-            <w:tcW w:type="dxa" w:w="6626"/>
-            <w:tcBorders>
-              <w:top w:val="single" w:color="D9DEE8" w:sz="4"/>
-              <w:left w:val="single" w:color="D9DEE8" w:sz="4"/>
-              <w:bottom w:val="single" w:color="D9DEE8" w:sz="4"/>
-              <w:right w:val="single" w:color="D9DEE8" w:sz="4"/>
-            </w:tcBorders>
-            <w:shd w:fill="FFFFFF" w:val="clear"/>
-            <w:tcMar>
-              <w:top w:type="dxa" w:w="90"/>
-              <w:left w:type="dxa" w:w="140"/>
-              <w:bottom w:type="dxa" w:w="90"/>
-              <w:right w:type="dxa" w:w="120"/>
-            </w:tcMar>
-          </w:tcPr>
-          <w:p>
-            <w:pPr>
-              <w:spacing w:after="0"/>
-            </w:pPr>
-            <w:r>
-              <w:rPr>
-                <w:color w:val="1A2233"/>
-                <w:sz w:val="20"/>
-                <w:szCs w:val="20"/>
-              </w:rPr>
-              <w:t xml:space="preserve">Anlage V / Feststellung je Jahr</w:t>
-            </w:r>
-          </w:p>
-        </w:tc>
-      </w:tr>
-      <w:tr>
-        <w:tc>
-          <w:tcPr>
-            <w:tcW w:type="dxa" w:w="2400"/>
-            <w:tcBorders>
-              <w:top w:val="single" w:color="D9DEE8" w:sz="4"/>
-              <w:left w:val="single" w:color="D9DEE8" w:sz="4"/>
-              <w:bottom w:val="single" w:color="D9DEE8" w:sz="4"/>
-              <w:right w:val="single" w:color="D9DEE8" w:sz="4"/>
-            </w:tcBorders>
-            <w:shd w:fill="FFFFFF" w:val="clear"/>
-            <w:tcMar>
-              <w:top w:type="dxa" w:w="90"/>
-              <w:left w:type="dxa" w:w="140"/>
-              <w:bottom w:type="dxa" w:w="90"/>
-              <w:right w:type="dxa" w:w="120"/>
-            </w:tcMar>
-          </w:tcPr>
-          <w:p>
-            <w:pPr>
-              <w:spacing w:after="0"/>
-            </w:pPr>
-            <w:r>
-              <w:rPr>
-                <w:b/>
-                <w:bCs/>
-                <w:color w:val="1A2233"/>
-                <w:sz w:val="20"/>
-                <w:szCs w:val="20"/>
-              </w:rPr>
-              <w:t xml:space="preserve">09_Konto</w:t>
-            </w:r>
-          </w:p>
-        </w:tc>
-        <w:tc>
-          <w:tcPr>
-            <w:tcW w:type="dxa" w:w="6626"/>
-            <w:tcBorders>
-              <w:top w:val="single" w:color="D9DEE8" w:sz="4"/>
-              <w:left w:val="single" w:color="D9DEE8" w:sz="4"/>
-              <w:bottom w:val="single" w:color="D9DEE8" w:sz="4"/>
-              <w:right w:val="single" w:color="D9DEE8" w:sz="4"/>
-            </w:tcBorders>
-            <w:shd w:fill="FFFFFF" w:val="clear"/>
-            <w:tcMar>
-              <w:top w:type="dxa" w:w="90"/>
-              <w:left w:type="dxa" w:w="140"/>
-              <w:bottom w:type="dxa" w:w="90"/>
-              <w:right w:type="dxa" w:w="120"/>
-            </w:tcMar>
-          </w:tcPr>
-          <w:p>
-            <w:pPr>
-              <w:spacing w:after="0"/>
-            </w:pPr>
-            <w:r>
-              <w:rPr>
-                <w:color w:val="1A2233"/>
-                <w:sz w:val="20"/>
-                <w:szCs w:val="20"/>
-              </w:rPr>
-              <w:t xml:space="preserve">Objektkonto – Auszüge, Kontoinfos</w:t>
-            </w:r>
-          </w:p>
-        </w:tc>
-      </w:tr>
-    </w:tbl>
+        <w:t xml:space="preserve">Die Vorlage 00–09 mit Beispiel-Inhalten – für jedes Objekt identisch</w:t>
+      </w:r>
+    </w:p>
     <w:p>
       <w:pPr>
         <w:pBdr>
@@ -2159,7 +1402,7 @@
         </w:rPr>
         <w:t xml:space="preserve">immoJUMP nutzen: </w:t>
       </w:r>
-      <w:hyperlink w:history="1" r:id="rIdng99u1c5vq6itxaitiee2">
+      <w:hyperlink w:history="1" r:id="rIdbbmz3vqjbe2q-iqxhypjh">
         <w:r>
           <w:rPr>
             <w:rStyle w:val="Hyperlink"/>
@@ -2177,7 +1420,7 @@
         </w:rPr>
         <w:t xml:space="preserve">   ·   Mehr erfahren: </w:t>
       </w:r>
-      <w:hyperlink w:history="1" r:id="rId1jwodgeamlpg0l1wdgkyk">
+      <w:hyperlink w:history="1" r:id="rIdgdzkuhdm2hnc-ryvt82nc">
         <w:r>
           <w:rPr>
             <w:rStyle w:val="Hyperlink"/>
@@ -2195,7 +1438,7 @@
         </w:rPr>
         <w:t xml:space="preserve">   ·   </w:t>
       </w:r>
-      <w:hyperlink w:history="1" r:id="rIdt0ossm6p8qhrqwnm2cgjj">
+      <w:hyperlink w:history="1" r:id="rIdrzwb3tm5h8tlmoiovlsfa">
         <w:r>
           <w:rPr>
             <w:rStyle w:val="Hyperlink"/>

</xml_diff>